<commit_message>
Add Excel fallback track, Activity E (three-track consistency) and its scripts
Stations B and C keep their assigned Python / R tracks, but each worksheet
now carries a "④-fallback" Excel procedure (parabola-vertex and half-height
centroid via LINEST/SUMPRODUCT; laser-wavelength back-solve via a 0.01 nm
grid search) so a group that is stuck on the tool for 20 minutes can still
reach the concept questions, and a checkbox records which track was used.

The three-track consistency check moves out of the stations into a
separate 15-minute Activity E: the same (NIST, measured) pairs from
station A fitted with Excel, Python and R. worksheets/activity_E/ ships
fit_pairs.xlsx / .py / .R and an example; Python and Excel were verified
to agree to 8 decimals (A = 0.99927789, B = 1.56219 nm, SE_A = 8.24e-4).

Co-Authored-By: Claude Fable 5.1 <noreply@anthropic.com>
</commit_message>
<xml_diff>
--- a/worksheets/拉曼校正實作_四張學習單_學生版.docx
+++ b/worksheets/拉曼校正實作_四張學習單_學生版.docx
@@ -731,6 +731,32 @@
         </w:tc>
       </w:tr>
     </w:tbl>
+    <w:p>
+      <w:pPr>
+        <w:spacing w:after="100" w:line="290"/>
+      </w:pPr>
+      <w:r>
+        <w:rPr>
+          <w:rFonts w:ascii="Microsoft JhengHei" w:cs="Microsoft JhengHei" w:eastAsia="Microsoft JhengHei" w:hAnsi="Microsoft JhengHei"/>
+          <w:sz w:val="20"/>
+          <w:szCs w:val="20"/>
+        </w:rPr>
+        <w:t xml:space="preserve">每一站都有 Excel 保底軌。指定工具卡住超過 20 分鐘（含環境設定），就改用該站 ④ 區塊後面的「④-保底」完成計算，並在 ③ 操作紀錄勾選「已改走保底軌」——這不扣分，但要誠實記錄。</w:t>
+      </w:r>
+    </w:p>
+    <w:p>
+      <w:pPr>
+        <w:spacing w:after="100" w:line="290"/>
+      </w:pPr>
+      <w:r>
+        <w:rPr>
+          <w:rFonts w:ascii="Microsoft JhengHei" w:cs="Microsoft JhengHei" w:eastAsia="Microsoft JhengHei" w:hAnsi="Microsoft JhengHei"/>
+          <w:sz w:val="20"/>
+          <w:szCs w:val="20"/>
+        </w:rPr>
+        <w:t xml:space="preserve">四站做完後還有一個 15 分鐘的活動 E（三軌一致性）：拿你們 A 站的資料，用 Excel、Python、R 各算一次，看三個答案是不是一模一樣。</w:t>
+      </w:r>
+    </w:p>
     <w:p>
       <w:pPr>
         <w:spacing w:after="120" w:line="290"/>
@@ -8562,6 +8588,19 @@
       </w:tr>
     </w:tbl>
     <w:p>
+      <w:pPr>
+        <w:spacing w:after="70" w:line="290"/>
+      </w:pPr>
+      <w:r>
+        <w:rPr>
+          <w:rFonts w:ascii="Microsoft JhengHei" w:cs="Microsoft JhengHei" w:eastAsia="Microsoft JhengHei" w:hAnsi="Microsoft JhengHei"/>
+          <w:sz w:val="20"/>
+          <w:szCs w:val="20"/>
+        </w:rPr>
+        <w:t xml:space="preserve">④ 實際使用的軌：☐ 指定軌（Python）　☐ Excel 保底軌　改走時間 ＿＿:＿＿　原因：☐ 環境裝不起來　☐ 檔案讀不進去　☐ 程式報錯看不懂　☐ 其他 ＿＿＿＿</w:t>
+      </w:r>
+    </w:p>
+    <w:p>
       <w:r>
         <w:br w:type="page"/>
       </w:r>
@@ -8964,6 +9003,476 @@
         </w:tc>
       </w:tr>
     </w:tbl>
+    <w:p>
+      <w:pPr>
+        <w:pStyle w:val="Heading2"/>
+        <w:spacing w:after="110" w:before="230"/>
+      </w:pPr>
+      <w:r>
+        <w:rPr>
+          <w:rFonts w:ascii="Microsoft JhengHei" w:cs="Microsoft JhengHei" w:eastAsia="Microsoft JhengHei" w:hAnsi="Microsoft JhengHei"/>
+          <w:b/>
+          <w:bCs/>
+          <w:color w:val="1F3A93"/>
+          <w:sz w:val="26"/>
+          <w:szCs w:val="26"/>
+        </w:rPr>
+        <w:t xml:space="preserve">④-保底　Excel 軌（指定軌卡住時使用；算出來的數字要和 Python 軌一致到 0.001 nm）</w:t>
+      </w:r>
+    </w:p>
+    <w:p>
+      <w:pPr>
+        <w:spacing w:after="100" w:line="290"/>
+      </w:pPr>
+      <w:r>
+        <w:rPr>
+          <w:rFonts w:ascii="Microsoft JhengHei" w:cs="Microsoft JhengHei" w:eastAsia="Microsoft JhengHei" w:hAnsi="Microsoft JhengHei"/>
+          <w:sz w:val="20"/>
+          <w:szCs w:val="20"/>
+        </w:rPr>
+        <w:t xml:space="preserve">把 laser.csv 貼進 Excel：A 欄波長 (nm)、B 欄 counts，資料從第 2 列開始。下面假設雷射峰在第 i 列（用 =MATCH(MAX(B:B),B:B,0) 找到 i）。</w:t>
+      </w:r>
+    </w:p>
+    <w:tbl>
+      <w:tblPr>
+        <w:tblW w:type="dxa" w:w="9640"/>
+        <w:tblBorders>
+          <w:top w:val="single" w:color="auto" w:sz="4"/>
+          <w:left w:val="single" w:color="auto" w:sz="4"/>
+          <w:bottom w:val="single" w:color="auto" w:sz="4"/>
+          <w:right w:val="single" w:color="auto" w:sz="4"/>
+          <w:insideH w:val="single" w:color="auto" w:sz="4"/>
+          <w:insideV w:val="single" w:color="auto" w:sz="4"/>
+        </w:tblBorders>
+      </w:tblPr>
+      <w:tblGrid>
+        <w:gridCol w:w="1500"/>
+        <w:gridCol w:w="5300"/>
+        <w:gridCol w:w="2400"/>
+      </w:tblGrid>
+      <w:tr>
+        <w:trPr>
+          <w:tblHeader/>
+        </w:trPr>
+        <w:tc>
+          <w:tcPr>
+            <w:tcW w:type="dxa" w:w="1500"/>
+            <w:shd w:fill="DDE3EC" w:color="auto" w:val="clear"/>
+            <w:tcMar>
+              <w:top w:type="dxa" w:w="60"/>
+              <w:left w:type="dxa" w:w="90"/>
+              <w:bottom w:type="dxa" w:w="60"/>
+              <w:right w:type="dxa" w:w="90"/>
+            </w:tcMar>
+            <w:vAlign w:val="center"/>
+          </w:tcPr>
+          <w:p>
+            <w:pPr>
+              <w:spacing w:after="0" w:line="290"/>
+            </w:pPr>
+            <w:r>
+              <w:rPr>
+                <w:rFonts w:ascii="Microsoft JhengHei" w:cs="Microsoft JhengHei" w:eastAsia="Microsoft JhengHei" w:hAnsi="Microsoft JhengHei"/>
+                <w:b/>
+                <w:bCs/>
+                <w:sz w:val="19"/>
+                <w:szCs w:val="19"/>
+              </w:rPr>
+              <w:t xml:space="preserve">步驟</w:t>
+            </w:r>
+          </w:p>
+        </w:tc>
+        <w:tc>
+          <w:tcPr>
+            <w:tcW w:type="dxa" w:w="5300"/>
+            <w:shd w:fill="DDE3EC" w:color="auto" w:val="clear"/>
+            <w:tcMar>
+              <w:top w:type="dxa" w:w="60"/>
+              <w:left w:type="dxa" w:w="90"/>
+              <w:bottom w:type="dxa" w:w="60"/>
+              <w:right w:type="dxa" w:w="90"/>
+            </w:tcMar>
+            <w:vAlign w:val="center"/>
+          </w:tcPr>
+          <w:p>
+            <w:pPr>
+              <w:spacing w:after="0" w:line="290"/>
+            </w:pPr>
+            <w:r>
+              <w:rPr>
+                <w:rFonts w:ascii="Microsoft JhengHei" w:cs="Microsoft JhengHei" w:eastAsia="Microsoft JhengHei" w:hAnsi="Microsoft JhengHei"/>
+                <w:b/>
+                <w:bCs/>
+                <w:sz w:val="19"/>
+                <w:szCs w:val="19"/>
+              </w:rPr>
+              <w:t xml:space="preserve">Excel 做法</w:t>
+            </w:r>
+          </w:p>
+        </w:tc>
+        <w:tc>
+          <w:tcPr>
+            <w:tcW w:type="dxa" w:w="2400"/>
+            <w:shd w:fill="DDE3EC" w:color="auto" w:val="clear"/>
+            <w:tcMar>
+              <w:top w:type="dxa" w:w="60"/>
+              <w:left w:type="dxa" w:w="90"/>
+              <w:bottom w:type="dxa" w:w="60"/>
+              <w:right w:type="dxa" w:w="90"/>
+            </w:tcMar>
+            <w:vAlign w:val="center"/>
+          </w:tcPr>
+          <w:p>
+            <w:pPr>
+              <w:spacing w:after="0" w:line="290"/>
+            </w:pPr>
+            <w:r>
+              <w:rPr>
+                <w:rFonts w:ascii="Microsoft JhengHei" w:cs="Microsoft JhengHei" w:eastAsia="Microsoft JhengHei" w:hAnsi="Microsoft JhengHei"/>
+                <w:b/>
+                <w:bCs/>
+                <w:sz w:val="19"/>
+                <w:szCs w:val="19"/>
+              </w:rPr>
+              <w:t xml:space="preserve">對應 Python 程式的哪一段</w:t>
+            </w:r>
+          </w:p>
+        </w:tc>
+      </w:tr>
+      <w:tr>
+        <w:trPr>
+          <w:tblHeader w:val="false"/>
+        </w:trPr>
+        <w:tc>
+          <w:tcPr>
+            <w:tcW w:type="dxa" w:w="1500"/>
+            <w:tcMar>
+              <w:top w:type="dxa" w:w="60"/>
+              <w:left w:type="dxa" w:w="90"/>
+              <w:bottom w:type="dxa" w:w="60"/>
+              <w:right w:type="dxa" w:w="90"/>
+            </w:tcMar>
+            <w:vAlign w:val="center"/>
+          </w:tcPr>
+          <w:p>
+            <w:pPr>
+              <w:spacing w:after="0" w:line="290"/>
+            </w:pPr>
+            <w:r>
+              <w:rPr>
+                <w:rFonts w:ascii="Microsoft JhengHei" w:cs="Microsoft JhengHei" w:eastAsia="Microsoft JhengHei" w:hAnsi="Microsoft JhengHei"/>
+                <w:sz w:val="19"/>
+                <w:szCs w:val="19"/>
+              </w:rPr>
+              <w:t xml:space="preserve">1　頂點法</w:t>
+            </w:r>
+          </w:p>
+        </w:tc>
+        <w:tc>
+          <w:tcPr>
+            <w:tcW w:type="dxa" w:w="5300"/>
+            <w:tcMar>
+              <w:top w:type="dxa" w:w="60"/>
+              <w:left w:type="dxa" w:w="90"/>
+              <w:bottom w:type="dxa" w:w="60"/>
+              <w:right w:type="dxa" w:w="90"/>
+            </w:tcMar>
+            <w:vAlign w:val="center"/>
+          </w:tcPr>
+          <w:p>
+            <w:pPr>
+              <w:spacing w:after="0" w:line="290"/>
+            </w:pPr>
+            <w:r>
+              <w:rPr>
+                <w:rFonts w:ascii="Microsoft JhengHei" w:cs="Microsoft JhengHei" w:eastAsia="Microsoft JhengHei" w:hAnsi="Microsoft JhengHei"/>
+                <w:sz w:val="19"/>
+                <w:szCs w:val="19"/>
+              </w:rPr>
+              <w:t xml:space="preserve">取第 i−2 到 i+2 共 5 列。在空白格輸入 =LINEST(B(i−2):B(i+2), A(i−2):A(i+2)^{1,2})，得到 {a, b, c}；頂點 = −b/(2a)，即 =−INDEX(該公式,2)/(2*INDEX(該公式,1))</w:t>
+            </w:r>
+          </w:p>
+        </w:tc>
+        <w:tc>
+          <w:tcPr>
+            <w:tcW w:type="dxa" w:w="2400"/>
+            <w:tcMar>
+              <w:top w:type="dxa" w:w="60"/>
+              <w:left w:type="dxa" w:w="90"/>
+              <w:bottom w:type="dxa" w:w="60"/>
+              <w:right w:type="dxa" w:w="90"/>
+            </w:tcMar>
+            <w:vAlign w:val="center"/>
+          </w:tcPr>
+          <w:p>
+            <w:pPr>
+              <w:spacing w:after="0" w:line="290"/>
+            </w:pPr>
+            <w:r>
+              <w:rPr>
+                <w:rFonts w:ascii="Microsoft JhengHei" w:cs="Microsoft JhengHei" w:eastAsia="Microsoft JhengHei" w:hAnsi="Microsoft JhengHei"/>
+                <w:sz w:val="19"/>
+                <w:szCs w:val="19"/>
+              </w:rPr>
+              <w:t xml:space="preserve">vertex()：五點二次擬合取頂點</w:t>
+            </w:r>
+          </w:p>
+        </w:tc>
+      </w:tr>
+      <w:tr>
+        <w:trPr>
+          <w:tblHeader w:val="false"/>
+        </w:trPr>
+        <w:tc>
+          <w:tcPr>
+            <w:tcW w:type="dxa" w:w="1500"/>
+            <w:tcMar>
+              <w:top w:type="dxa" w:w="60"/>
+              <w:left w:type="dxa" w:w="90"/>
+              <w:bottom w:type="dxa" w:w="60"/>
+              <w:right w:type="dxa" w:w="90"/>
+            </w:tcMar>
+            <w:vAlign w:val="center"/>
+          </w:tcPr>
+          <w:p>
+            <w:pPr>
+              <w:spacing w:after="0" w:line="290"/>
+            </w:pPr>
+            <w:r>
+              <w:rPr>
+                <w:rFonts w:ascii="Microsoft JhengHei" w:cs="Microsoft JhengHei" w:eastAsia="Microsoft JhengHei" w:hAnsi="Microsoft JhengHei"/>
+                <w:sz w:val="19"/>
+                <w:szCs w:val="19"/>
+              </w:rPr>
+              <w:t xml:space="preserve">2　半高質心</w:t>
+            </w:r>
+          </w:p>
+        </w:tc>
+        <w:tc>
+          <w:tcPr>
+            <w:tcW w:type="dxa" w:w="5300"/>
+            <w:tcMar>
+              <w:top w:type="dxa" w:w="60"/>
+              <w:left w:type="dxa" w:w="90"/>
+              <w:bottom w:type="dxa" w:w="60"/>
+              <w:right w:type="dxa" w:w="90"/>
+            </w:tcMar>
+            <w:vAlign w:val="center"/>
+          </w:tcPr>
+          <w:p>
+            <w:pPr>
+              <w:spacing w:after="0" w:line="290"/>
+            </w:pPr>
+            <w:r>
+              <w:rPr>
+                <w:rFonts w:ascii="Microsoft JhengHei" w:cs="Microsoft JhengHei" w:eastAsia="Microsoft JhengHei" w:hAnsi="Microsoft JhengHei"/>
+                <w:sz w:val="19"/>
+                <w:szCs w:val="19"/>
+              </w:rPr>
+              <w:t xml:space="preserve">取峰頂 ±1.5 nm 的列。C 欄 = B − 該範圍的最小值；D 欄 = IF(C &gt; MAX(C 範圍)/2, C, 0)；質心 = SUMPRODUCT(A 範圍, D 範圍)/SUM(D 範圍)</w:t>
+            </w:r>
+          </w:p>
+        </w:tc>
+        <w:tc>
+          <w:tcPr>
+            <w:tcW w:type="dxa" w:w="2400"/>
+            <w:tcMar>
+              <w:top w:type="dxa" w:w="60"/>
+              <w:left w:type="dxa" w:w="90"/>
+              <w:bottom w:type="dxa" w:w="60"/>
+              <w:right w:type="dxa" w:w="90"/>
+            </w:tcMar>
+            <w:vAlign w:val="center"/>
+          </w:tcPr>
+          <w:p>
+            <w:pPr>
+              <w:spacing w:after="0" w:line="290"/>
+            </w:pPr>
+            <w:r>
+              <w:rPr>
+                <w:rFonts w:ascii="Microsoft JhengHei" w:cs="Microsoft JhengHei" w:eastAsia="Microsoft JhengHei" w:hAnsi="Microsoft JhengHei"/>
+                <w:sz w:val="19"/>
+                <w:szCs w:val="19"/>
+              </w:rPr>
+              <w:t xml:space="preserve">half_centroid()：只用高於半高的點算重心——TODO-1 的答案就在 D 欄那個 /2</w:t>
+            </w:r>
+          </w:p>
+        </w:tc>
+      </w:tr>
+      <w:tr>
+        <w:trPr>
+          <w:tblHeader w:val="false"/>
+        </w:trPr>
+        <w:tc>
+          <w:tcPr>
+            <w:tcW w:type="dxa" w:w="1500"/>
+            <w:tcMar>
+              <w:top w:type="dxa" w:w="60"/>
+              <w:left w:type="dxa" w:w="90"/>
+              <w:bottom w:type="dxa" w:w="60"/>
+              <w:right w:type="dxa" w:w="90"/>
+            </w:tcMar>
+            <w:vAlign w:val="center"/>
+          </w:tcPr>
+          <w:p>
+            <w:pPr>
+              <w:spacing w:after="0" w:line="290"/>
+            </w:pPr>
+            <w:r>
+              <w:rPr>
+                <w:rFonts w:ascii="Microsoft JhengHei" w:cs="Microsoft JhengHei" w:eastAsia="Microsoft JhengHei" w:hAnsi="Microsoft JhengHei"/>
+                <w:sz w:val="19"/>
+                <w:szCs w:val="19"/>
+              </w:rPr>
+              <w:t xml:space="preserve">3　套 A 站修正</w:t>
+            </w:r>
+          </w:p>
+        </w:tc>
+        <w:tc>
+          <w:tcPr>
+            <w:tcW w:type="dxa" w:w="5300"/>
+            <w:tcMar>
+              <w:top w:type="dxa" w:w="60"/>
+              <w:left w:type="dxa" w:w="90"/>
+              <w:bottom w:type="dxa" w:w="60"/>
+              <w:right w:type="dxa" w:w="90"/>
+            </w:tcMar>
+            <w:vAlign w:val="center"/>
+          </w:tcPr>
+          <w:p>
+            <w:pPr>
+              <w:spacing w:after="0" w:line="290"/>
+            </w:pPr>
+            <w:r>
+              <w:rPr>
+                <w:rFonts w:ascii="Microsoft JhengHei" w:cs="Microsoft JhengHei" w:eastAsia="Microsoft JhengHei" w:hAnsi="Microsoft JhengHei"/>
+                <w:sz w:val="19"/>
+                <w:szCs w:val="19"/>
+              </w:rPr>
+              <w:t xml:space="preserve">λ_L = A × 量測峰位 + B，A、B 抄傳遞卡</w:t>
+            </w:r>
+          </w:p>
+        </w:tc>
+        <w:tc>
+          <w:tcPr>
+            <w:tcW w:type="dxa" w:w="2400"/>
+            <w:tcMar>
+              <w:top w:type="dxa" w:w="60"/>
+              <w:left w:type="dxa" w:w="90"/>
+              <w:bottom w:type="dxa" w:w="60"/>
+              <w:right w:type="dxa" w:w="90"/>
+            </w:tcMar>
+            <w:vAlign w:val="center"/>
+          </w:tcPr>
+          <w:p>
+            <w:pPr>
+              <w:spacing w:after="0" w:line="290"/>
+            </w:pPr>
+            <w:r>
+              <w:rPr>
+                <w:rFonts w:ascii="Microsoft JhengHei" w:cs="Microsoft JhengHei" w:eastAsia="Microsoft JhengHei" w:hAnsi="Microsoft JhengHei"/>
+                <w:sz w:val="19"/>
+                <w:szCs w:val="19"/>
+              </w:rPr>
+              <w:t xml:space="preserve">TODO-2</w:t>
+            </w:r>
+          </w:p>
+        </w:tc>
+      </w:tr>
+      <w:tr>
+        <w:trPr>
+          <w:tblHeader w:val="false"/>
+        </w:trPr>
+        <w:tc>
+          <w:tcPr>
+            <w:tcW w:type="dxa" w:w="1500"/>
+            <w:tcMar>
+              <w:top w:type="dxa" w:w="60"/>
+              <w:left w:type="dxa" w:w="90"/>
+              <w:bottom w:type="dxa" w:w="60"/>
+              <w:right w:type="dxa" w:w="90"/>
+            </w:tcMar>
+            <w:vAlign w:val="center"/>
+          </w:tcPr>
+          <w:p>
+            <w:pPr>
+              <w:spacing w:after="0" w:line="290"/>
+            </w:pPr>
+            <w:r>
+              <w:rPr>
+                <w:rFonts w:ascii="Microsoft JhengHei" w:cs="Microsoft JhengHei" w:eastAsia="Microsoft JhengHei" w:hAnsi="Microsoft JhengHei"/>
+                <w:sz w:val="19"/>
+                <w:szCs w:val="19"/>
+              </w:rPr>
+              <w:t xml:space="preserve">4　對照</w:t>
+            </w:r>
+          </w:p>
+        </w:tc>
+        <w:tc>
+          <w:tcPr>
+            <w:tcW w:type="dxa" w:w="5300"/>
+            <w:tcMar>
+              <w:top w:type="dxa" w:w="60"/>
+              <w:left w:type="dxa" w:w="90"/>
+              <w:bottom w:type="dxa" w:w="60"/>
+              <w:right w:type="dxa" w:w="90"/>
+            </w:tcMar>
+            <w:vAlign w:val="center"/>
+          </w:tcPr>
+          <w:p>
+            <w:pPr>
+              <w:spacing w:after="0" w:line="290"/>
+            </w:pPr>
+            <w:r>
+              <w:rPr>
+                <w:rFonts w:ascii="Microsoft JhengHei" w:cs="Microsoft JhengHei" w:eastAsia="Microsoft JhengHei" w:hAnsi="Microsoft JhengHei"/>
+                <w:sz w:val="19"/>
+                <w:szCs w:val="19"/>
+              </w:rPr>
+              <w:t xml:space="preserve">兩種峰位法的結果填回下面的表；和走 Python 軌的組別比對，差異應小於 0.001 nm</w:t>
+            </w:r>
+          </w:p>
+        </w:tc>
+        <w:tc>
+          <w:tcPr>
+            <w:tcW w:type="dxa" w:w="2400"/>
+            <w:tcMar>
+              <w:top w:type="dxa" w:w="60"/>
+              <w:left w:type="dxa" w:w="90"/>
+              <w:bottom w:type="dxa" w:w="60"/>
+              <w:right w:type="dxa" w:w="90"/>
+            </w:tcMar>
+            <w:vAlign w:val="center"/>
+          </w:tcPr>
+          <w:p>
+            <w:pPr>
+              <w:spacing w:after="0" w:line="290"/>
+            </w:pPr>
+            <w:r>
+              <w:rPr>
+                <w:rFonts w:ascii="Microsoft JhengHei" w:cs="Microsoft JhengHei" w:eastAsia="Microsoft JhengHei" w:hAnsi="Microsoft JhengHei"/>
+                <w:sz w:val="19"/>
+                <w:szCs w:val="19"/>
+              </w:rPr>
+              <w:t xml:space="preserve">—</w:t>
+            </w:r>
+          </w:p>
+        </w:tc>
+      </w:tr>
+    </w:tbl>
+    <w:p>
+      <w:pPr>
+        <w:spacing w:after="100" w:line="290"/>
+      </w:pPr>
+      <w:r>
+        <w:rPr>
+          <w:rFonts w:ascii="Microsoft JhengHei" w:cs="Microsoft JhengHei" w:eastAsia="Microsoft JhengHei" w:hAnsi="Microsoft JhengHei"/>
+          <w:sz w:val="20"/>
+          <w:szCs w:val="20"/>
+        </w:rPr>
+        <w:t xml:space="preserve">教材網頁的 unit1b_excel.xlsx 工作表 1 有做好的範例。若 ^{1,2} 打不出來，先在 E 欄放 x²，改用 =LINEST(y 範圍, x 範圍:x² 範圍)。</w:t>
+      </w:r>
+    </w:p>
     <w:p>
       <w:pPr>
         <w:spacing w:after="120" w:line="290"/>
@@ -11689,6 +12198,19 @@
       </w:tr>
     </w:tbl>
     <w:p>
+      <w:pPr>
+        <w:spacing w:after="70" w:line="290"/>
+      </w:pPr>
+      <w:r>
+        <w:rPr>
+          <w:rFonts w:ascii="Microsoft JhengHei" w:cs="Microsoft JhengHei" w:eastAsia="Microsoft JhengHei" w:hAnsi="Microsoft JhengHei"/>
+          <w:sz w:val="20"/>
+          <w:szCs w:val="20"/>
+        </w:rPr>
+        <w:t xml:space="preserve">④ 實際使用的軌：☐ 指定軌（R）　☐ Excel 保底軌　改走時間 ＿＿:＿＿　原因：☐ 環境裝不起來　☐ 檔案讀不進去　☐ 程式報錯看不懂　☐ 其他 ＿＿＿＿</w:t>
+      </w:r>
+    </w:p>
+    <w:p>
       <w:r>
         <w:br w:type="page"/>
       </w:r>
@@ -12052,6 +12574,556 @@
         </w:tc>
       </w:tr>
     </w:tbl>
+    <w:p>
+      <w:pPr>
+        <w:pStyle w:val="Heading2"/>
+        <w:spacing w:after="110" w:before="230"/>
+      </w:pPr>
+      <w:r>
+        <w:rPr>
+          <w:rFonts w:ascii="Microsoft JhengHei" w:cs="Microsoft JhengHei" w:eastAsia="Microsoft JhengHei" w:hAnsi="Microsoft JhengHei"/>
+          <w:b/>
+          <w:bCs/>
+          <w:color w:val="1F3A93"/>
+          <w:sz w:val="26"/>
+          <w:szCs w:val="26"/>
+        </w:rPr>
+        <w:t xml:space="preserve">④-保底　Excel 軌（用「網格搜尋」取代 optimize()；λ_L 應與 R 軌一致到 0.01 nm）</w:t>
+      </w:r>
+    </w:p>
+    <w:p>
+      <w:pPr>
+        <w:spacing w:after="100" w:line="290"/>
+      </w:pPr>
+      <w:r>
+        <w:rPr>
+          <w:rFonts w:ascii="Microsoft JhengHei" w:cs="Microsoft JhengHei" w:eastAsia="Microsoft JhengHei" w:hAnsi="Microsoft JhengHei"/>
+          <w:sz w:val="20"/>
+          <w:szCs w:val="20"/>
+        </w:rPr>
+        <w:t xml:space="preserve">把苯甲酸譜貼進 Excel（A 欄報告位移 cm⁻¹、B 欄強度）。先找峰：在每個文獻值 ±20 cm⁻¹ 的範圍內找最高點，把 6 個峰的報告位移填進表——不要先想候選。</w:t>
+      </w:r>
+    </w:p>
+    <w:tbl>
+      <w:tblPr>
+        <w:tblW w:type="dxa" w:w="9640"/>
+        <w:tblBorders>
+          <w:top w:val="single" w:color="auto" w:sz="4"/>
+          <w:left w:val="single" w:color="auto" w:sz="4"/>
+          <w:bottom w:val="single" w:color="auto" w:sz="4"/>
+          <w:right w:val="single" w:color="auto" w:sz="4"/>
+          <w:insideH w:val="single" w:color="auto" w:sz="4"/>
+          <w:insideV w:val="single" w:color="auto" w:sz="4"/>
+        </w:tblBorders>
+      </w:tblPr>
+      <w:tblGrid>
+        <w:gridCol w:w="1500"/>
+        <w:gridCol w:w="5300"/>
+        <w:gridCol w:w="2400"/>
+      </w:tblGrid>
+      <w:tr>
+        <w:trPr>
+          <w:tblHeader/>
+        </w:trPr>
+        <w:tc>
+          <w:tcPr>
+            <w:tcW w:type="dxa" w:w="1500"/>
+            <w:shd w:fill="DDE3EC" w:color="auto" w:val="clear"/>
+            <w:tcMar>
+              <w:top w:type="dxa" w:w="60"/>
+              <w:left w:type="dxa" w:w="90"/>
+              <w:bottom w:type="dxa" w:w="60"/>
+              <w:right w:type="dxa" w:w="90"/>
+            </w:tcMar>
+            <w:vAlign w:val="center"/>
+          </w:tcPr>
+          <w:p>
+            <w:pPr>
+              <w:spacing w:after="0" w:line="290"/>
+            </w:pPr>
+            <w:r>
+              <w:rPr>
+                <w:rFonts w:ascii="Microsoft JhengHei" w:cs="Microsoft JhengHei" w:eastAsia="Microsoft JhengHei" w:hAnsi="Microsoft JhengHei"/>
+                <w:b/>
+                <w:bCs/>
+                <w:sz w:val="19"/>
+                <w:szCs w:val="19"/>
+              </w:rPr>
+              <w:t xml:space="preserve">步驟</w:t>
+            </w:r>
+          </w:p>
+        </w:tc>
+        <w:tc>
+          <w:tcPr>
+            <w:tcW w:type="dxa" w:w="5300"/>
+            <w:shd w:fill="DDE3EC" w:color="auto" w:val="clear"/>
+            <w:tcMar>
+              <w:top w:type="dxa" w:w="60"/>
+              <w:left w:type="dxa" w:w="90"/>
+              <w:bottom w:type="dxa" w:w="60"/>
+              <w:right w:type="dxa" w:w="90"/>
+            </w:tcMar>
+            <w:vAlign w:val="center"/>
+          </w:tcPr>
+          <w:p>
+            <w:pPr>
+              <w:spacing w:after="0" w:line="290"/>
+            </w:pPr>
+            <w:r>
+              <w:rPr>
+                <w:rFonts w:ascii="Microsoft JhengHei" w:cs="Microsoft JhengHei" w:eastAsia="Microsoft JhengHei" w:hAnsi="Microsoft JhengHei"/>
+                <w:b/>
+                <w:bCs/>
+                <w:sz w:val="19"/>
+                <w:szCs w:val="19"/>
+              </w:rPr>
+              <w:t xml:space="preserve">Excel 做法</w:t>
+            </w:r>
+          </w:p>
+        </w:tc>
+        <w:tc>
+          <w:tcPr>
+            <w:tcW w:type="dxa" w:w="2400"/>
+            <w:shd w:fill="DDE3EC" w:color="auto" w:val="clear"/>
+            <w:tcMar>
+              <w:top w:type="dxa" w:w="60"/>
+              <w:left w:type="dxa" w:w="90"/>
+              <w:bottom w:type="dxa" w:w="60"/>
+              <w:right w:type="dxa" w:w="90"/>
+            </w:tcMar>
+            <w:vAlign w:val="center"/>
+          </w:tcPr>
+          <w:p>
+            <w:pPr>
+              <w:spacing w:after="0" w:line="290"/>
+            </w:pPr>
+            <w:r>
+              <w:rPr>
+                <w:rFonts w:ascii="Microsoft JhengHei" w:cs="Microsoft JhengHei" w:eastAsia="Microsoft JhengHei" w:hAnsi="Microsoft JhengHei"/>
+                <w:b/>
+                <w:bCs/>
+                <w:sz w:val="19"/>
+                <w:szCs w:val="19"/>
+              </w:rPr>
+              <w:t xml:space="preserve">對應 R 程式的哪一段</w:t>
+            </w:r>
+          </w:p>
+        </w:tc>
+      </w:tr>
+      <w:tr>
+        <w:trPr>
+          <w:tblHeader w:val="false"/>
+        </w:trPr>
+        <w:tc>
+          <w:tcPr>
+            <w:tcW w:type="dxa" w:w="1500"/>
+            <w:tcMar>
+              <w:top w:type="dxa" w:w="60"/>
+              <w:left w:type="dxa" w:w="90"/>
+              <w:bottom w:type="dxa" w:w="60"/>
+              <w:right w:type="dxa" w:w="90"/>
+            </w:tcMar>
+            <w:vAlign w:val="center"/>
+          </w:tcPr>
+          <w:p>
+            <w:pPr>
+              <w:spacing w:after="0" w:line="290"/>
+            </w:pPr>
+            <w:r>
+              <w:rPr>
+                <w:rFonts w:ascii="Microsoft JhengHei" w:cs="Microsoft JhengHei" w:eastAsia="Microsoft JhengHei" w:hAnsi="Microsoft JhengHei"/>
+                <w:sz w:val="19"/>
+                <w:szCs w:val="19"/>
+              </w:rPr>
+              <w:t xml:space="preserve">1　位移→波長</w:t>
+            </w:r>
+          </w:p>
+        </w:tc>
+        <w:tc>
+          <w:tcPr>
+            <w:tcW w:type="dxa" w:w="5300"/>
+            <w:tcMar>
+              <w:top w:type="dxa" w:w="60"/>
+              <w:left w:type="dxa" w:w="90"/>
+              <w:bottom w:type="dxa" w:w="60"/>
+              <w:right w:type="dxa" w:w="90"/>
+            </w:tcMar>
+            <w:vAlign w:val="center"/>
+          </w:tcPr>
+          <w:p>
+            <w:pPr>
+              <w:spacing w:after="0" w:line="290"/>
+            </w:pPr>
+            <w:r>
+              <w:rPr>
+                <w:rFonts w:ascii="Microsoft JhengHei" w:cs="Microsoft JhengHei" w:eastAsia="Microsoft JhengHei" w:hAnsi="Microsoft JhengHei"/>
+                <w:sz w:val="19"/>
+                <w:szCs w:val="19"/>
+              </w:rPr>
+              <w:t xml:space="preserve">每個峰：λ_rep = 1/(1/785 − ν/10⁷)，ν 是報告位移 (cm⁻¹)</w:t>
+            </w:r>
+          </w:p>
+        </w:tc>
+        <w:tc>
+          <w:tcPr>
+            <w:tcW w:type="dxa" w:w="2400"/>
+            <w:tcMar>
+              <w:top w:type="dxa" w:w="60"/>
+              <w:left w:type="dxa" w:w="90"/>
+              <w:bottom w:type="dxa" w:w="60"/>
+              <w:right w:type="dxa" w:w="90"/>
+            </w:tcMar>
+            <w:vAlign w:val="center"/>
+          </w:tcPr>
+          <w:p>
+            <w:pPr>
+              <w:spacing w:after="0" w:line="290"/>
+            </w:pPr>
+            <w:r>
+              <w:rPr>
+                <w:rFonts w:ascii="Microsoft JhengHei" w:cs="Microsoft JhengHei" w:eastAsia="Microsoft JhengHei" w:hAnsi="Microsoft JhengHei"/>
+                <w:sz w:val="19"/>
+                <w:szCs w:val="19"/>
+              </w:rPr>
+              <w:t xml:space="preserve">lam_rep</w:t>
+            </w:r>
+          </w:p>
+        </w:tc>
+      </w:tr>
+      <w:tr>
+        <w:trPr>
+          <w:tblHeader w:val="false"/>
+        </w:trPr>
+        <w:tc>
+          <w:tcPr>
+            <w:tcW w:type="dxa" w:w="1500"/>
+            <w:tcMar>
+              <w:top w:type="dxa" w:w="60"/>
+              <w:left w:type="dxa" w:w="90"/>
+              <w:bottom w:type="dxa" w:w="60"/>
+              <w:right w:type="dxa" w:w="90"/>
+            </w:tcMar>
+            <w:vAlign w:val="center"/>
+          </w:tcPr>
+          <w:p>
+            <w:pPr>
+              <w:spacing w:after="0" w:line="290"/>
+            </w:pPr>
+            <w:r>
+              <w:rPr>
+                <w:rFonts w:ascii="Microsoft JhengHei" w:cs="Microsoft JhengHei" w:eastAsia="Microsoft JhengHei" w:hAnsi="Microsoft JhengHei"/>
+                <w:sz w:val="19"/>
+                <w:szCs w:val="19"/>
+              </w:rPr>
+              <w:t xml:space="preserve">2　套 A 站修正</w:t>
+            </w:r>
+          </w:p>
+        </w:tc>
+        <w:tc>
+          <w:tcPr>
+            <w:tcW w:type="dxa" w:w="5300"/>
+            <w:tcMar>
+              <w:top w:type="dxa" w:w="60"/>
+              <w:left w:type="dxa" w:w="90"/>
+              <w:bottom w:type="dxa" w:w="60"/>
+              <w:right w:type="dxa" w:w="90"/>
+            </w:tcMar>
+            <w:vAlign w:val="center"/>
+          </w:tcPr>
+          <w:p>
+            <w:pPr>
+              <w:spacing w:after="0" w:line="290"/>
+            </w:pPr>
+            <w:r>
+              <w:rPr>
+                <w:rFonts w:ascii="Microsoft JhengHei" w:cs="Microsoft JhengHei" w:eastAsia="Microsoft JhengHei" w:hAnsi="Microsoft JhengHei"/>
+                <w:sz w:val="19"/>
+                <w:szCs w:val="19"/>
+              </w:rPr>
+              <w:t xml:space="preserve">λ_true = A × λ_rep + B，A、B 抄傳遞卡</w:t>
+            </w:r>
+          </w:p>
+        </w:tc>
+        <w:tc>
+          <w:tcPr>
+            <w:tcW w:type="dxa" w:w="2400"/>
+            <w:tcMar>
+              <w:top w:type="dxa" w:w="60"/>
+              <w:left w:type="dxa" w:w="90"/>
+              <w:bottom w:type="dxa" w:w="60"/>
+              <w:right w:type="dxa" w:w="90"/>
+            </w:tcMar>
+            <w:vAlign w:val="center"/>
+          </w:tcPr>
+          <w:p>
+            <w:pPr>
+              <w:spacing w:after="0" w:line="290"/>
+            </w:pPr>
+            <w:r>
+              <w:rPr>
+                <w:rFonts w:ascii="Microsoft JhengHei" w:cs="Microsoft JhengHei" w:eastAsia="Microsoft JhengHei" w:hAnsi="Microsoft JhengHei"/>
+                <w:sz w:val="19"/>
+                <w:szCs w:val="19"/>
+              </w:rPr>
+              <w:t xml:space="preserve">lam_true（TODO-1）</w:t>
+            </w:r>
+          </w:p>
+        </w:tc>
+      </w:tr>
+      <w:tr>
+        <w:trPr>
+          <w:tblHeader w:val="false"/>
+        </w:trPr>
+        <w:tc>
+          <w:tcPr>
+            <w:tcW w:type="dxa" w:w="1500"/>
+            <w:tcMar>
+              <w:top w:type="dxa" w:w="60"/>
+              <w:left w:type="dxa" w:w="90"/>
+              <w:bottom w:type="dxa" w:w="60"/>
+              <w:right w:type="dxa" w:w="90"/>
+            </w:tcMar>
+            <w:vAlign w:val="center"/>
+          </w:tcPr>
+          <w:p>
+            <w:pPr>
+              <w:spacing w:after="0" w:line="290"/>
+            </w:pPr>
+            <w:r>
+              <w:rPr>
+                <w:rFonts w:ascii="Microsoft JhengHei" w:cs="Microsoft JhengHei" w:eastAsia="Microsoft JhengHei" w:hAnsi="Microsoft JhengHei"/>
+                <w:sz w:val="19"/>
+                <w:szCs w:val="19"/>
+              </w:rPr>
+              <w:t xml:space="preserve">3　試驗 λ_L 網格</w:t>
+            </w:r>
+          </w:p>
+        </w:tc>
+        <w:tc>
+          <w:tcPr>
+            <w:tcW w:type="dxa" w:w="5300"/>
+            <w:tcMar>
+              <w:top w:type="dxa" w:w="60"/>
+              <w:left w:type="dxa" w:w="90"/>
+              <w:bottom w:type="dxa" w:w="60"/>
+              <w:right w:type="dxa" w:w="90"/>
+            </w:tcMar>
+            <w:vAlign w:val="center"/>
+          </w:tcPr>
+          <w:p>
+            <w:pPr>
+              <w:spacing w:after="0" w:line="290"/>
+            </w:pPr>
+            <w:r>
+              <w:rPr>
+                <w:rFonts w:ascii="Microsoft JhengHei" w:cs="Microsoft JhengHei" w:eastAsia="Microsoft JhengHei" w:hAnsi="Microsoft JhengHei"/>
+                <w:sz w:val="19"/>
+                <w:szCs w:val="19"/>
+              </w:rPr>
+              <w:t xml:space="preserve">從 783.50 到 786.00，每 0.01 nm 一列（251 列）。每列對 6 個峰算 ν′ = 10⁷ × (1/λ_L − 1/λ_true)，再算 (ν′ − 文獻值)²</w:t>
+            </w:r>
+          </w:p>
+        </w:tc>
+        <w:tc>
+          <w:tcPr>
+            <w:tcW w:type="dxa" w:w="2400"/>
+            <w:tcMar>
+              <w:top w:type="dxa" w:w="60"/>
+              <w:left w:type="dxa" w:w="90"/>
+              <w:bottom w:type="dxa" w:w="60"/>
+              <w:right w:type="dxa" w:w="90"/>
+            </w:tcMar>
+            <w:vAlign w:val="center"/>
+          </w:tcPr>
+          <w:p>
+            <w:pPr>
+              <w:spacing w:after="0" w:line="290"/>
+            </w:pPr>
+            <w:r>
+              <w:rPr>
+                <w:rFonts w:ascii="Microsoft JhengHei" w:cs="Microsoft JhengHei" w:eastAsia="Microsoft JhengHei" w:hAnsi="Microsoft JhengHei"/>
+                <w:sz w:val="19"/>
+                <w:szCs w:val="19"/>
+              </w:rPr>
+              <w:t xml:space="preserve">cost() 裡的 nu 與 (nu − L)²</w:t>
+            </w:r>
+          </w:p>
+        </w:tc>
+      </w:tr>
+      <w:tr>
+        <w:trPr>
+          <w:tblHeader w:val="false"/>
+        </w:trPr>
+        <w:tc>
+          <w:tcPr>
+            <w:tcW w:type="dxa" w:w="1500"/>
+            <w:tcMar>
+              <w:top w:type="dxa" w:w="60"/>
+              <w:left w:type="dxa" w:w="90"/>
+              <w:bottom w:type="dxa" w:w="60"/>
+              <w:right w:type="dxa" w:w="90"/>
+            </w:tcMar>
+            <w:vAlign w:val="center"/>
+          </w:tcPr>
+          <w:p>
+            <w:pPr>
+              <w:spacing w:after="0" w:line="290"/>
+            </w:pPr>
+            <w:r>
+              <w:rPr>
+                <w:rFonts w:ascii="Microsoft JhengHei" w:cs="Microsoft JhengHei" w:eastAsia="Microsoft JhengHei" w:hAnsi="Microsoft JhengHei"/>
+                <w:sz w:val="19"/>
+                <w:szCs w:val="19"/>
+              </w:rPr>
+              <w:t xml:space="preserve">4　找最小</w:t>
+            </w:r>
+          </w:p>
+        </w:tc>
+        <w:tc>
+          <w:tcPr>
+            <w:tcW w:type="dxa" w:w="5300"/>
+            <w:tcMar>
+              <w:top w:type="dxa" w:w="60"/>
+              <w:left w:type="dxa" w:w="90"/>
+              <w:bottom w:type="dxa" w:w="60"/>
+              <w:right w:type="dxa" w:w="90"/>
+            </w:tcMar>
+            <w:vAlign w:val="center"/>
+          </w:tcPr>
+          <w:p>
+            <w:pPr>
+              <w:spacing w:after="0" w:line="290"/>
+            </w:pPr>
+            <w:r>
+              <w:rPr>
+                <w:rFonts w:ascii="Microsoft JhengHei" w:cs="Microsoft JhengHei" w:eastAsia="Microsoft JhengHei" w:hAnsi="Microsoft JhengHei"/>
+                <w:sz w:val="19"/>
+                <w:szCs w:val="19"/>
+              </w:rPr>
+              <w:t xml:space="preserve">每列 rms = SQRT(AVERAGE(六個平方))；λ_L = INDEX(λ_L 欄, MATCH(MIN(rms 欄), rms 欄, 0))</w:t>
+            </w:r>
+          </w:p>
+        </w:tc>
+        <w:tc>
+          <w:tcPr>
+            <w:tcW w:type="dxa" w:w="2400"/>
+            <w:tcMar>
+              <w:top w:type="dxa" w:w="60"/>
+              <w:left w:type="dxa" w:w="90"/>
+              <w:bottom w:type="dxa" w:w="60"/>
+              <w:right w:type="dxa" w:w="90"/>
+            </w:tcMar>
+            <w:vAlign w:val="center"/>
+          </w:tcPr>
+          <w:p>
+            <w:pPr>
+              <w:spacing w:after="0" w:line="290"/>
+            </w:pPr>
+            <w:r>
+              <w:rPr>
+                <w:rFonts w:ascii="Microsoft JhengHei" w:cs="Microsoft JhengHei" w:eastAsia="Microsoft JhengHei" w:hAnsi="Microsoft JhengHei"/>
+                <w:sz w:val="19"/>
+                <w:szCs w:val="19"/>
+              </w:rPr>
+              <w:t xml:space="preserve">optimize() 回傳的 minimum 與 objective</w:t>
+            </w:r>
+          </w:p>
+        </w:tc>
+      </w:tr>
+      <w:tr>
+        <w:trPr>
+          <w:tblHeader w:val="false"/>
+        </w:trPr>
+        <w:tc>
+          <w:tcPr>
+            <w:tcW w:type="dxa" w:w="1500"/>
+            <w:tcMar>
+              <w:top w:type="dxa" w:w="60"/>
+              <w:left w:type="dxa" w:w="90"/>
+              <w:bottom w:type="dxa" w:w="60"/>
+              <w:right w:type="dxa" w:w="90"/>
+            </w:tcMar>
+            <w:vAlign w:val="center"/>
+          </w:tcPr>
+          <w:p>
+            <w:pPr>
+              <w:spacing w:after="0" w:line="290"/>
+            </w:pPr>
+            <w:r>
+              <w:rPr>
+                <w:rFonts w:ascii="Microsoft JhengHei" w:cs="Microsoft JhengHei" w:eastAsia="Microsoft JhengHei" w:hAnsi="Microsoft JhengHei"/>
+                <w:sz w:val="19"/>
+                <w:szCs w:val="19"/>
+              </w:rPr>
+              <w:t xml:space="preserve">5　咖啡因</w:t>
+            </w:r>
+          </w:p>
+        </w:tc>
+        <w:tc>
+          <w:tcPr>
+            <w:tcW w:type="dxa" w:w="5300"/>
+            <w:tcMar>
+              <w:top w:type="dxa" w:w="60"/>
+              <w:left w:type="dxa" w:w="90"/>
+              <w:bottom w:type="dxa" w:w="60"/>
+              <w:right w:type="dxa" w:w="90"/>
+            </w:tcMar>
+            <w:vAlign w:val="center"/>
+          </w:tcPr>
+          <w:p>
+            <w:pPr>
+              <w:spacing w:after="0" w:line="290"/>
+            </w:pPr>
+            <w:r>
+              <w:rPr>
+                <w:rFonts w:ascii="Microsoft JhengHei" w:cs="Microsoft JhengHei" w:eastAsia="Microsoft JhengHei" w:hAnsi="Microsoft JhengHei"/>
+                <w:sz w:val="19"/>
+                <w:szCs w:val="19"/>
+              </w:rPr>
+              <w:t xml:space="preserve">同一張表換資料再做一次；兩個 λ_L 填回下面的表</w:t>
+            </w:r>
+          </w:p>
+        </w:tc>
+        <w:tc>
+          <w:tcPr>
+            <w:tcW w:type="dxa" w:w="2400"/>
+            <w:tcMar>
+              <w:top w:type="dxa" w:w="60"/>
+              <w:left w:type="dxa" w:w="90"/>
+              <w:bottom w:type="dxa" w:w="60"/>
+              <w:right w:type="dxa" w:w="90"/>
+            </w:tcMar>
+            <w:vAlign w:val="center"/>
+          </w:tcPr>
+          <w:p>
+            <w:pPr>
+              <w:spacing w:after="0" w:line="290"/>
+            </w:pPr>
+            <w:r>
+              <w:rPr>
+                <w:rFonts w:ascii="Microsoft JhengHei" w:cs="Microsoft JhengHei" w:eastAsia="Microsoft JhengHei" w:hAnsi="Microsoft JhengHei"/>
+                <w:sz w:val="19"/>
+                <w:szCs w:val="19"/>
+              </w:rPr>
+              <w:t xml:space="preserve">第二次執行</w:t>
+            </w:r>
+          </w:p>
+        </w:tc>
+      </w:tr>
+    </w:tbl>
+    <w:p>
+      <w:pPr>
+        <w:spacing w:after="100" w:line="290"/>
+      </w:pPr>
+      <w:r>
+        <w:rPr>
+          <w:rFonts w:ascii="Microsoft JhengHei" w:cs="Microsoft JhengHei" w:eastAsia="Microsoft JhengHei" w:hAnsi="Microsoft JhengHei"/>
+          <w:sz w:val="20"/>
+          <w:szCs w:val="20"/>
+        </w:rPr>
+        <w:t xml:space="preserve">教材網頁的 unit1b_excel.xlsx 工作表 2 就是這張網格表的成品，可以直接複製、改貼資料。</w:t>
+      </w:r>
+    </w:p>
     <w:p>
       <w:pPr>
         <w:spacing w:after="120" w:line="290"/>
@@ -18423,6 +19495,1346 @@
           <w:sz w:val="40"/>
           <w:szCs w:val="40"/>
         </w:rPr>
+        <w:t xml:space="preserve">活動 E｜三把尺量同一根線：三軌一致性</w:t>
+      </w:r>
+    </w:p>
+    <w:p>
+      <w:pPr>
+        <w:pBdr>
+          <w:bottom w:val="single" w:color="1F3A93" w:sz="6" w:space="8"/>
+        </w:pBdr>
+        <w:spacing w:after="260"/>
+        <w:jc w:val="center"/>
+      </w:pPr>
+      <w:r>
+        <w:rPr>
+          <w:rFonts w:ascii="Microsoft JhengHei" w:cs="Microsoft JhengHei" w:eastAsia="Microsoft JhengHei" w:hAnsi="Microsoft JhengHei"/>
+          <w:color w:val="5B6472"/>
+          <w:sz w:val="20"/>
+          <w:szCs w:val="20"/>
+        </w:rPr>
+        <w:t xml:space="preserve">四站結束後，或 D 站等待儀器時進行　　時間：15 分鐘　　工具：Excel、Python、R 三種都用</w:t>
+      </w:r>
+    </w:p>
+    <w:p>
+      <w:pPr>
+        <w:spacing w:after="140" w:line="290"/>
+      </w:pPr>
+      <w:r>
+        <w:rPr>
+          <w:rFonts w:ascii="Microsoft JhengHei" w:cs="Microsoft JhengHei" w:eastAsia="Microsoft JhengHei" w:hAnsi="Microsoft JhengHei"/>
+          <w:b/>
+          <w:bCs/>
+          <w:sz w:val="20"/>
+          <w:szCs w:val="20"/>
+        </w:rPr>
+        <w:t xml:space="preserve">組別：＿＿＿＿＿　三位成員：＿＿＿＿＿／＿＿＿＿＿／＿＿＿＿＿　日期：＿＿＿＿年＿＿月＿＿日</w:t>
+      </w:r>
+    </w:p>
+    <w:p>
+      <w:pPr>
+        <w:pStyle w:val="Heading2"/>
+        <w:spacing w:after="110" w:before="230"/>
+      </w:pPr>
+      <w:r>
+        <w:rPr>
+          <w:rFonts w:ascii="Microsoft JhengHei" w:cs="Microsoft JhengHei" w:eastAsia="Microsoft JhengHei" w:hAnsi="Microsoft JhengHei"/>
+          <w:b/>
+          <w:bCs/>
+          <w:color w:val="1F3A93"/>
+          <w:sz w:val="26"/>
+          <w:szCs w:val="26"/>
+        </w:rPr>
+        <w:t xml:space="preserve">學習目標</w:t>
+      </w:r>
+    </w:p>
+    <w:p>
+      <w:pPr>
+        <w:spacing w:after="100" w:line="290"/>
+      </w:pPr>
+      <w:r>
+        <w:rPr>
+          <w:rFonts w:ascii="Microsoft JhengHei" w:cs="Microsoft JhengHei" w:eastAsia="Microsoft JhengHei" w:hAnsi="Microsoft JhengHei"/>
+          <w:sz w:val="20"/>
+          <w:szCs w:val="20"/>
+        </w:rPr>
+        <w:t xml:space="preserve">說明「同一份資料，三種工具算出同一個答案」，並把「工具問題」和「資料問題」分開。</w:t>
+      </w:r>
+    </w:p>
+    <w:p>
+      <w:pPr>
+        <w:spacing w:after="100" w:line="290"/>
+      </w:pPr>
+      <w:r>
+        <w:rPr>
+          <w:rFonts w:ascii="Microsoft JhengHei" w:cs="Microsoft JhengHei" w:eastAsia="Microsoft JhengHei" w:hAnsi="Microsoft JhengHei"/>
+          <w:sz w:val="20"/>
+          <w:szCs w:val="20"/>
+        </w:rPr>
+        <w:t xml:space="preserve">說出三種工具各自的成本（時間、出錯點），以及什麼情況下值得用程式。</w:t>
+      </w:r>
+    </w:p>
+    <w:p>
+      <w:pPr>
+        <w:pStyle w:val="Heading2"/>
+        <w:spacing w:after="110" w:before="230"/>
+      </w:pPr>
+      <w:r>
+        <w:rPr>
+          <w:rFonts w:ascii="Microsoft JhengHei" w:cs="Microsoft JhengHei" w:eastAsia="Microsoft JhengHei" w:hAnsi="Microsoft JhengHei"/>
+          <w:b/>
+          <w:bCs/>
+          <w:color w:val="1F3A93"/>
+          <w:sz w:val="26"/>
+          <w:szCs w:val="26"/>
+        </w:rPr>
+        <w:t xml:space="preserve">材料</w:t>
+      </w:r>
+    </w:p>
+    <w:p>
+      <w:pPr>
+        <w:spacing w:after="100" w:line="290"/>
+      </w:pPr>
+      <w:r>
+        <w:rPr>
+          <w:rFonts w:ascii="Microsoft JhengHei" w:cs="Microsoft JhengHei" w:eastAsia="Microsoft JhengHei" w:hAnsi="Microsoft JhengHei"/>
+          <w:sz w:val="20"/>
+          <w:szCs w:val="20"/>
+        </w:rPr>
+        <w:t xml:space="preserve">你們 A 站 ④ 那張表：12 條 Ne 線的 NIST 波長與你量到的峰位——就是兩欄數字，不需要原始光譜。</w:t>
+      </w:r>
+    </w:p>
+    <w:p>
+      <w:pPr>
+        <w:spacing w:after="100" w:line="290"/>
+      </w:pPr>
+      <w:r>
+        <w:rPr>
+          <w:rFonts w:ascii="Microsoft JhengHei" w:cs="Microsoft JhengHei" w:eastAsia="Microsoft JhengHei" w:hAnsi="Microsoft JhengHei"/>
+          <w:sz w:val="20"/>
+          <w:szCs w:val="20"/>
+        </w:rPr>
+        <w:t xml:space="preserve">教師提供的三份現成腳本（worksheets/activity_E/）：fit_pairs.xlsx、fit_pairs.py、fit_pairs.R。三份都只要把兩欄數字貼進去，或改一個檔名。</w:t>
+      </w:r>
+    </w:p>
+    <w:p>
+      <w:pPr>
+        <w:pStyle w:val="Heading2"/>
+        <w:spacing w:after="110" w:before="230"/>
+      </w:pPr>
+      <w:r>
+        <w:rPr>
+          <w:rFonts w:ascii="Microsoft JhengHei" w:cs="Microsoft JhengHei" w:eastAsia="Microsoft JhengHei" w:hAnsi="Microsoft JhengHei"/>
+          <w:b/>
+          <w:bCs/>
+          <w:color w:val="1F3A93"/>
+          <w:sz w:val="26"/>
+          <w:szCs w:val="26"/>
+        </w:rPr>
+        <w:t xml:space="preserve">步驟</w:t>
+      </w:r>
+    </w:p>
+    <w:p>
+      <w:pPr>
+        <w:spacing w:after="100" w:line="290"/>
+      </w:pPr>
+      <w:r>
+        <w:rPr>
+          <w:rFonts w:ascii="Microsoft JhengHei" w:cs="Microsoft JhengHei" w:eastAsia="Microsoft JhengHei" w:hAnsi="Microsoft JhengHei"/>
+          <w:sz w:val="20"/>
+          <w:szCs w:val="20"/>
+        </w:rPr>
+        <w:t xml:space="preserve">1.　三個人各領一種工具，用同一份資料，算完前不要互相看答案。</w:t>
+      </w:r>
+    </w:p>
+    <w:p>
+      <w:pPr>
+        <w:spacing w:after="100" w:line="290"/>
+      </w:pPr>
+      <w:r>
+        <w:rPr>
+          <w:rFonts w:ascii="Microsoft JhengHei" w:cs="Microsoft JhengHei" w:eastAsia="Microsoft JhengHei" w:hAnsi="Microsoft JhengHei"/>
+          <w:sz w:val="20"/>
+          <w:szCs w:val="20"/>
+        </w:rPr>
+        <w:t xml:space="preserve">2.　各自算出斜率 A、截距 B、SE_A、t 值、殘差標準誤，記下開始與完成時間。</w:t>
+      </w:r>
+    </w:p>
+    <w:p>
+      <w:pPr>
+        <w:spacing w:after="100" w:line="290"/>
+      </w:pPr>
+      <w:r>
+        <w:rPr>
+          <w:rFonts w:ascii="Microsoft JhengHei" w:cs="Microsoft JhengHei" w:eastAsia="Microsoft JhengHei" w:hAnsi="Microsoft JhengHei"/>
+          <w:sz w:val="20"/>
+          <w:szCs w:val="20"/>
+        </w:rPr>
+        <w:t xml:space="preserve">3.　填表、比對：A 應一致到小數第 6 位。</w:t>
+      </w:r>
+    </w:p>
+    <w:p>
+      <w:pPr>
+        <w:spacing w:after="100" w:line="290"/>
+      </w:pPr>
+      <w:r>
+        <w:rPr>
+          <w:rFonts w:ascii="Microsoft JhengHei" w:cs="Microsoft JhengHei" w:eastAsia="Microsoft JhengHei" w:hAnsi="Microsoft JhengHei"/>
+          <w:sz w:val="20"/>
+          <w:szCs w:val="20"/>
+        </w:rPr>
+        <w:t xml:space="preserve">4.　若不一致，先檢查用了哪幾條線、有沒有多貼或少貼一列、標題列有沒有被當成資料——不要懷疑軟體。</w:t>
+      </w:r>
+    </w:p>
+    <w:p>
+      <w:pPr>
+        <w:pStyle w:val="Heading2"/>
+        <w:spacing w:after="110" w:before="230"/>
+      </w:pPr>
+      <w:r>
+        <w:rPr>
+          <w:rFonts w:ascii="Microsoft JhengHei" w:cs="Microsoft JhengHei" w:eastAsia="Microsoft JhengHei" w:hAnsi="Microsoft JhengHei"/>
+          <w:b/>
+          <w:bCs/>
+          <w:color w:val="1F3A93"/>
+          <w:sz w:val="26"/>
+          <w:szCs w:val="26"/>
+        </w:rPr>
+        <w:t xml:space="preserve">紀錄表</w:t>
+      </w:r>
+    </w:p>
+    <w:tbl>
+      <w:tblPr>
+        <w:tblW w:type="dxa" w:w="9640"/>
+        <w:tblBorders>
+          <w:top w:val="single" w:color="auto" w:sz="4"/>
+          <w:left w:val="single" w:color="auto" w:sz="4"/>
+          <w:bottom w:val="single" w:color="auto" w:sz="4"/>
+          <w:right w:val="single" w:color="auto" w:sz="4"/>
+          <w:insideH w:val="single" w:color="auto" w:sz="4"/>
+          <w:insideV w:val="single" w:color="auto" w:sz="4"/>
+        </w:tblBorders>
+      </w:tblPr>
+      <w:tblGrid>
+        <w:gridCol w:w="2600"/>
+        <w:gridCol w:w="2400"/>
+        <w:gridCol w:w="2400"/>
+        <w:gridCol w:w="2240"/>
+      </w:tblGrid>
+      <w:tr>
+        <w:trPr>
+          <w:tblHeader/>
+        </w:trPr>
+        <w:tc>
+          <w:tcPr>
+            <w:tcW w:type="dxa" w:w="2600"/>
+            <w:shd w:fill="DDE3EC" w:color="auto" w:val="clear"/>
+            <w:tcMar>
+              <w:top w:type="dxa" w:w="60"/>
+              <w:left w:type="dxa" w:w="90"/>
+              <w:bottom w:type="dxa" w:w="60"/>
+              <w:right w:type="dxa" w:w="90"/>
+            </w:tcMar>
+            <w:vAlign w:val="center"/>
+          </w:tcPr>
+          <w:p>
+            <w:pPr>
+              <w:spacing w:after="0" w:line="290"/>
+            </w:pPr>
+            <w:r>
+              <w:rPr>
+                <w:rFonts w:ascii="Microsoft JhengHei" w:cs="Microsoft JhengHei" w:eastAsia="Microsoft JhengHei" w:hAnsi="Microsoft JhengHei"/>
+                <w:b/>
+                <w:bCs/>
+                <w:sz w:val="19"/>
+                <w:szCs w:val="19"/>
+              </w:rPr>
+              <w:t xml:space="preserve">工具</w:t>
+            </w:r>
+          </w:p>
+        </w:tc>
+        <w:tc>
+          <w:tcPr>
+            <w:tcW w:type="dxa" w:w="2400"/>
+            <w:shd w:fill="DDE3EC" w:color="auto" w:val="clear"/>
+            <w:tcMar>
+              <w:top w:type="dxa" w:w="60"/>
+              <w:left w:type="dxa" w:w="90"/>
+              <w:bottom w:type="dxa" w:w="60"/>
+              <w:right w:type="dxa" w:w="90"/>
+            </w:tcMar>
+            <w:vAlign w:val="center"/>
+          </w:tcPr>
+          <w:p>
+            <w:pPr>
+              <w:spacing w:after="0" w:line="290"/>
+            </w:pPr>
+            <w:r>
+              <w:rPr>
+                <w:rFonts w:ascii="Microsoft JhengHei" w:cs="Microsoft JhengHei" w:eastAsia="Microsoft JhengHei" w:hAnsi="Microsoft JhengHei"/>
+                <w:b/>
+                <w:bCs/>
+                <w:sz w:val="19"/>
+                <w:szCs w:val="19"/>
+              </w:rPr>
+              <w:t xml:space="preserve">斜率 A</w:t>
+            </w:r>
+          </w:p>
+        </w:tc>
+        <w:tc>
+          <w:tcPr>
+            <w:tcW w:type="dxa" w:w="2400"/>
+            <w:shd w:fill="DDE3EC" w:color="auto" w:val="clear"/>
+            <w:tcMar>
+              <w:top w:type="dxa" w:w="60"/>
+              <w:left w:type="dxa" w:w="90"/>
+              <w:bottom w:type="dxa" w:w="60"/>
+              <w:right w:type="dxa" w:w="90"/>
+            </w:tcMar>
+            <w:vAlign w:val="center"/>
+          </w:tcPr>
+          <w:p>
+            <w:pPr>
+              <w:spacing w:after="0" w:line="290"/>
+            </w:pPr>
+            <w:r>
+              <w:rPr>
+                <w:rFonts w:ascii="Microsoft JhengHei" w:cs="Microsoft JhengHei" w:eastAsia="Microsoft JhengHei" w:hAnsi="Microsoft JhengHei"/>
+                <w:b/>
+                <w:bCs/>
+                <w:sz w:val="19"/>
+                <w:szCs w:val="19"/>
+              </w:rPr>
+              <w:t xml:space="preserve">截距 B (nm)</w:t>
+            </w:r>
+          </w:p>
+        </w:tc>
+        <w:tc>
+          <w:tcPr>
+            <w:tcW w:type="dxa" w:w="2240"/>
+            <w:shd w:fill="DDE3EC" w:color="auto" w:val="clear"/>
+            <w:tcMar>
+              <w:top w:type="dxa" w:w="60"/>
+              <w:left w:type="dxa" w:w="90"/>
+              <w:bottom w:type="dxa" w:w="60"/>
+              <w:right w:type="dxa" w:w="90"/>
+            </w:tcMar>
+            <w:vAlign w:val="center"/>
+          </w:tcPr>
+          <w:p>
+            <w:pPr>
+              <w:spacing w:after="0" w:line="290"/>
+            </w:pPr>
+            <w:r>
+              <w:rPr>
+                <w:rFonts w:ascii="Microsoft JhengHei" w:cs="Microsoft JhengHei" w:eastAsia="Microsoft JhengHei" w:hAnsi="Microsoft JhengHei"/>
+                <w:b/>
+                <w:bCs/>
+                <w:sz w:val="19"/>
+                <w:szCs w:val="19"/>
+              </w:rPr>
+              <w:t xml:space="preserve">殘差標準誤 (pm)／t 值</w:t>
+            </w:r>
+          </w:p>
+        </w:tc>
+      </w:tr>
+      <w:tr>
+        <w:trPr>
+          <w:tblHeader w:val="false"/>
+        </w:trPr>
+        <w:tc>
+          <w:tcPr>
+            <w:tcW w:type="dxa" w:w="2600"/>
+            <w:tcMar>
+              <w:top w:type="dxa" w:w="60"/>
+              <w:left w:type="dxa" w:w="90"/>
+              <w:bottom w:type="dxa" w:w="60"/>
+              <w:right w:type="dxa" w:w="90"/>
+            </w:tcMar>
+            <w:vAlign w:val="center"/>
+          </w:tcPr>
+          <w:p>
+            <w:pPr>
+              <w:spacing w:after="0" w:line="290"/>
+            </w:pPr>
+            <w:r>
+              <w:rPr>
+                <w:rFonts w:ascii="Microsoft JhengHei" w:cs="Microsoft JhengHei" w:eastAsia="Microsoft JhengHei" w:hAnsi="Microsoft JhengHei"/>
+                <w:sz w:val="19"/>
+                <w:szCs w:val="19"/>
+              </w:rPr>
+              <w:t xml:space="preserve">Excel（LINEST）</w:t>
+            </w:r>
+          </w:p>
+        </w:tc>
+        <w:tc>
+          <w:tcPr>
+            <w:tcW w:type="dxa" w:w="2400"/>
+            <w:tcMar>
+              <w:top w:type="dxa" w:w="60"/>
+              <w:left w:type="dxa" w:w="90"/>
+              <w:bottom w:type="dxa" w:w="60"/>
+              <w:right w:type="dxa" w:w="90"/>
+            </w:tcMar>
+            <w:vAlign w:val="center"/>
+          </w:tcPr>
+          <w:p>
+            <w:pPr>
+              <w:spacing w:after="0" w:line="290"/>
+            </w:pPr>
+            <w:r>
+              <w:rPr>
+                <w:rFonts w:ascii="Microsoft JhengHei" w:cs="Microsoft JhengHei" w:eastAsia="Microsoft JhengHei" w:hAnsi="Microsoft JhengHei"/>
+                <w:sz w:val="19"/>
+                <w:szCs w:val="19"/>
+              </w:rPr>
+              <w:t xml:space="preserve"/>
+            </w:r>
+          </w:p>
+        </w:tc>
+        <w:tc>
+          <w:tcPr>
+            <w:tcW w:type="dxa" w:w="2400"/>
+            <w:tcMar>
+              <w:top w:type="dxa" w:w="60"/>
+              <w:left w:type="dxa" w:w="90"/>
+              <w:bottom w:type="dxa" w:w="60"/>
+              <w:right w:type="dxa" w:w="90"/>
+            </w:tcMar>
+            <w:vAlign w:val="center"/>
+          </w:tcPr>
+          <w:p>
+            <w:pPr>
+              <w:spacing w:after="0" w:line="290"/>
+            </w:pPr>
+            <w:r>
+              <w:rPr>
+                <w:rFonts w:ascii="Microsoft JhengHei" w:cs="Microsoft JhengHei" w:eastAsia="Microsoft JhengHei" w:hAnsi="Microsoft JhengHei"/>
+                <w:sz w:val="19"/>
+                <w:szCs w:val="19"/>
+              </w:rPr>
+              <w:t xml:space="preserve"/>
+            </w:r>
+          </w:p>
+        </w:tc>
+        <w:tc>
+          <w:tcPr>
+            <w:tcW w:type="dxa" w:w="2240"/>
+            <w:tcMar>
+              <w:top w:type="dxa" w:w="60"/>
+              <w:left w:type="dxa" w:w="90"/>
+              <w:bottom w:type="dxa" w:w="60"/>
+              <w:right w:type="dxa" w:w="90"/>
+            </w:tcMar>
+            <w:vAlign w:val="center"/>
+          </w:tcPr>
+          <w:p>
+            <w:pPr>
+              <w:spacing w:after="0" w:line="290"/>
+            </w:pPr>
+            <w:r>
+              <w:rPr>
+                <w:rFonts w:ascii="Microsoft JhengHei" w:cs="Microsoft JhengHei" w:eastAsia="Microsoft JhengHei" w:hAnsi="Microsoft JhengHei"/>
+                <w:sz w:val="19"/>
+                <w:szCs w:val="19"/>
+              </w:rPr>
+              <w:t xml:space="preserve"/>
+            </w:r>
+          </w:p>
+        </w:tc>
+      </w:tr>
+      <w:tr>
+        <w:trPr>
+          <w:tblHeader w:val="false"/>
+        </w:trPr>
+        <w:tc>
+          <w:tcPr>
+            <w:tcW w:type="dxa" w:w="2600"/>
+            <w:tcMar>
+              <w:top w:type="dxa" w:w="60"/>
+              <w:left w:type="dxa" w:w="90"/>
+              <w:bottom w:type="dxa" w:w="60"/>
+              <w:right w:type="dxa" w:w="90"/>
+            </w:tcMar>
+            <w:vAlign w:val="center"/>
+          </w:tcPr>
+          <w:p>
+            <w:pPr>
+              <w:spacing w:after="0" w:line="290"/>
+            </w:pPr>
+            <w:r>
+              <w:rPr>
+                <w:rFonts w:ascii="Microsoft JhengHei" w:cs="Microsoft JhengHei" w:eastAsia="Microsoft JhengHei" w:hAnsi="Microsoft JhengHei"/>
+                <w:sz w:val="19"/>
+                <w:szCs w:val="19"/>
+              </w:rPr>
+              <w:t xml:space="preserve">Python（polyfit）</w:t>
+            </w:r>
+          </w:p>
+        </w:tc>
+        <w:tc>
+          <w:tcPr>
+            <w:tcW w:type="dxa" w:w="2400"/>
+            <w:tcMar>
+              <w:top w:type="dxa" w:w="60"/>
+              <w:left w:type="dxa" w:w="90"/>
+              <w:bottom w:type="dxa" w:w="60"/>
+              <w:right w:type="dxa" w:w="90"/>
+            </w:tcMar>
+            <w:vAlign w:val="center"/>
+          </w:tcPr>
+          <w:p>
+            <w:pPr>
+              <w:spacing w:after="0" w:line="290"/>
+            </w:pPr>
+            <w:r>
+              <w:rPr>
+                <w:rFonts w:ascii="Microsoft JhengHei" w:cs="Microsoft JhengHei" w:eastAsia="Microsoft JhengHei" w:hAnsi="Microsoft JhengHei"/>
+                <w:sz w:val="19"/>
+                <w:szCs w:val="19"/>
+              </w:rPr>
+              <w:t xml:space="preserve"/>
+            </w:r>
+          </w:p>
+        </w:tc>
+        <w:tc>
+          <w:tcPr>
+            <w:tcW w:type="dxa" w:w="2400"/>
+            <w:tcMar>
+              <w:top w:type="dxa" w:w="60"/>
+              <w:left w:type="dxa" w:w="90"/>
+              <w:bottom w:type="dxa" w:w="60"/>
+              <w:right w:type="dxa" w:w="90"/>
+            </w:tcMar>
+            <w:vAlign w:val="center"/>
+          </w:tcPr>
+          <w:p>
+            <w:pPr>
+              <w:spacing w:after="0" w:line="290"/>
+            </w:pPr>
+            <w:r>
+              <w:rPr>
+                <w:rFonts w:ascii="Microsoft JhengHei" w:cs="Microsoft JhengHei" w:eastAsia="Microsoft JhengHei" w:hAnsi="Microsoft JhengHei"/>
+                <w:sz w:val="19"/>
+                <w:szCs w:val="19"/>
+              </w:rPr>
+              <w:t xml:space="preserve"/>
+            </w:r>
+          </w:p>
+        </w:tc>
+        <w:tc>
+          <w:tcPr>
+            <w:tcW w:type="dxa" w:w="2240"/>
+            <w:tcMar>
+              <w:top w:type="dxa" w:w="60"/>
+              <w:left w:type="dxa" w:w="90"/>
+              <w:bottom w:type="dxa" w:w="60"/>
+              <w:right w:type="dxa" w:w="90"/>
+            </w:tcMar>
+            <w:vAlign w:val="center"/>
+          </w:tcPr>
+          <w:p>
+            <w:pPr>
+              <w:spacing w:after="0" w:line="290"/>
+            </w:pPr>
+            <w:r>
+              <w:rPr>
+                <w:rFonts w:ascii="Microsoft JhengHei" w:cs="Microsoft JhengHei" w:eastAsia="Microsoft JhengHei" w:hAnsi="Microsoft JhengHei"/>
+                <w:sz w:val="19"/>
+                <w:szCs w:val="19"/>
+              </w:rPr>
+              <w:t xml:space="preserve"/>
+            </w:r>
+          </w:p>
+        </w:tc>
+      </w:tr>
+      <w:tr>
+        <w:trPr>
+          <w:tblHeader w:val="false"/>
+        </w:trPr>
+        <w:tc>
+          <w:tcPr>
+            <w:tcW w:type="dxa" w:w="2600"/>
+            <w:tcMar>
+              <w:top w:type="dxa" w:w="60"/>
+              <w:left w:type="dxa" w:w="90"/>
+              <w:bottom w:type="dxa" w:w="60"/>
+              <w:right w:type="dxa" w:w="90"/>
+            </w:tcMar>
+            <w:vAlign w:val="center"/>
+          </w:tcPr>
+          <w:p>
+            <w:pPr>
+              <w:spacing w:after="0" w:line="290"/>
+            </w:pPr>
+            <w:r>
+              <w:rPr>
+                <w:rFonts w:ascii="Microsoft JhengHei" w:cs="Microsoft JhengHei" w:eastAsia="Microsoft JhengHei" w:hAnsi="Microsoft JhengHei"/>
+                <w:sz w:val="19"/>
+                <w:szCs w:val="19"/>
+              </w:rPr>
+              <w:t xml:space="preserve">R（lm）</w:t>
+            </w:r>
+          </w:p>
+        </w:tc>
+        <w:tc>
+          <w:tcPr>
+            <w:tcW w:type="dxa" w:w="2400"/>
+            <w:tcMar>
+              <w:top w:type="dxa" w:w="60"/>
+              <w:left w:type="dxa" w:w="90"/>
+              <w:bottom w:type="dxa" w:w="60"/>
+              <w:right w:type="dxa" w:w="90"/>
+            </w:tcMar>
+            <w:vAlign w:val="center"/>
+          </w:tcPr>
+          <w:p>
+            <w:pPr>
+              <w:spacing w:after="0" w:line="290"/>
+            </w:pPr>
+            <w:r>
+              <w:rPr>
+                <w:rFonts w:ascii="Microsoft JhengHei" w:cs="Microsoft JhengHei" w:eastAsia="Microsoft JhengHei" w:hAnsi="Microsoft JhengHei"/>
+                <w:sz w:val="19"/>
+                <w:szCs w:val="19"/>
+              </w:rPr>
+              <w:t xml:space="preserve"/>
+            </w:r>
+          </w:p>
+        </w:tc>
+        <w:tc>
+          <w:tcPr>
+            <w:tcW w:type="dxa" w:w="2400"/>
+            <w:tcMar>
+              <w:top w:type="dxa" w:w="60"/>
+              <w:left w:type="dxa" w:w="90"/>
+              <w:bottom w:type="dxa" w:w="60"/>
+              <w:right w:type="dxa" w:w="90"/>
+            </w:tcMar>
+            <w:vAlign w:val="center"/>
+          </w:tcPr>
+          <w:p>
+            <w:pPr>
+              <w:spacing w:after="0" w:line="290"/>
+            </w:pPr>
+            <w:r>
+              <w:rPr>
+                <w:rFonts w:ascii="Microsoft JhengHei" w:cs="Microsoft JhengHei" w:eastAsia="Microsoft JhengHei" w:hAnsi="Microsoft JhengHei"/>
+                <w:sz w:val="19"/>
+                <w:szCs w:val="19"/>
+              </w:rPr>
+              <w:t xml:space="preserve"/>
+            </w:r>
+          </w:p>
+        </w:tc>
+        <w:tc>
+          <w:tcPr>
+            <w:tcW w:type="dxa" w:w="2240"/>
+            <w:tcMar>
+              <w:top w:type="dxa" w:w="60"/>
+              <w:left w:type="dxa" w:w="90"/>
+              <w:bottom w:type="dxa" w:w="60"/>
+              <w:right w:type="dxa" w:w="90"/>
+            </w:tcMar>
+            <w:vAlign w:val="center"/>
+          </w:tcPr>
+          <w:p>
+            <w:pPr>
+              <w:spacing w:after="0" w:line="290"/>
+            </w:pPr>
+            <w:r>
+              <w:rPr>
+                <w:rFonts w:ascii="Microsoft JhengHei" w:cs="Microsoft JhengHei" w:eastAsia="Microsoft JhengHei" w:hAnsi="Microsoft JhengHei"/>
+                <w:sz w:val="19"/>
+                <w:szCs w:val="19"/>
+              </w:rPr>
+              <w:t xml:space="preserve"/>
+            </w:r>
+          </w:p>
+        </w:tc>
+      </w:tr>
+    </w:tbl>
+    <w:p>
+      <w:pPr>
+        <w:spacing w:after="100" w:line="290"/>
+      </w:pPr>
+      <w:r>
+        <w:rPr>
+          <w:rFonts w:ascii="Microsoft JhengHei" w:cs="Microsoft JhengHei" w:eastAsia="Microsoft JhengHei" w:hAnsi="Microsoft JhengHei"/>
+          <w:sz w:val="20"/>
+          <w:szCs w:val="20"/>
+        </w:rPr>
+        <w:t xml:space="preserve"/>
+      </w:r>
+    </w:p>
+    <w:tbl>
+      <w:tblPr>
+        <w:tblW w:type="dxa" w:w="9640"/>
+        <w:tblBorders>
+          <w:top w:val="single" w:color="auto" w:sz="4"/>
+          <w:left w:val="single" w:color="auto" w:sz="4"/>
+          <w:bottom w:val="single" w:color="auto" w:sz="4"/>
+          <w:right w:val="single" w:color="auto" w:sz="4"/>
+          <w:insideH w:val="single" w:color="auto" w:sz="4"/>
+          <w:insideV w:val="single" w:color="auto" w:sz="4"/>
+        </w:tblBorders>
+      </w:tblPr>
+      <w:tblGrid>
+        <w:gridCol w:w="2600"/>
+        <w:gridCol w:w="2400"/>
+        <w:gridCol w:w="2400"/>
+        <w:gridCol w:w="2240"/>
+      </w:tblGrid>
+      <w:tr>
+        <w:trPr>
+          <w:tblHeader/>
+        </w:trPr>
+        <w:tc>
+          <w:tcPr>
+            <w:tcW w:type="dxa" w:w="2600"/>
+            <w:shd w:fill="DDE3EC" w:color="auto" w:val="clear"/>
+            <w:tcMar>
+              <w:top w:type="dxa" w:w="60"/>
+              <w:left w:type="dxa" w:w="90"/>
+              <w:bottom w:type="dxa" w:w="60"/>
+              <w:right w:type="dxa" w:w="90"/>
+            </w:tcMar>
+            <w:vAlign w:val="center"/>
+          </w:tcPr>
+          <w:p>
+            <w:pPr>
+              <w:spacing w:after="0" w:line="290"/>
+            </w:pPr>
+            <w:r>
+              <w:rPr>
+                <w:rFonts w:ascii="Microsoft JhengHei" w:cs="Microsoft JhengHei" w:eastAsia="Microsoft JhengHei" w:hAnsi="Microsoft JhengHei"/>
+                <w:b/>
+                <w:bCs/>
+                <w:sz w:val="19"/>
+                <w:szCs w:val="19"/>
+              </w:rPr>
+              <w:t xml:space="preserve">工具</w:t>
+            </w:r>
+          </w:p>
+        </w:tc>
+        <w:tc>
+          <w:tcPr>
+            <w:tcW w:type="dxa" w:w="2400"/>
+            <w:shd w:fill="DDE3EC" w:color="auto" w:val="clear"/>
+            <w:tcMar>
+              <w:top w:type="dxa" w:w="60"/>
+              <w:left w:type="dxa" w:w="90"/>
+              <w:bottom w:type="dxa" w:w="60"/>
+              <w:right w:type="dxa" w:w="90"/>
+            </w:tcMar>
+            <w:vAlign w:val="center"/>
+          </w:tcPr>
+          <w:p>
+            <w:pPr>
+              <w:spacing w:after="0" w:line="290"/>
+            </w:pPr>
+            <w:r>
+              <w:rPr>
+                <w:rFonts w:ascii="Microsoft JhengHei" w:cs="Microsoft JhengHei" w:eastAsia="Microsoft JhengHei" w:hAnsi="Microsoft JhengHei"/>
+                <w:b/>
+                <w:bCs/>
+                <w:sz w:val="19"/>
+                <w:szCs w:val="19"/>
+              </w:rPr>
+              <w:t xml:space="preserve">開始→完成（分鐘）</w:t>
+            </w:r>
+          </w:p>
+        </w:tc>
+        <w:tc>
+          <w:tcPr>
+            <w:tcW w:type="dxa" w:w="2400"/>
+            <w:shd w:fill="DDE3EC" w:color="auto" w:val="clear"/>
+            <w:tcMar>
+              <w:top w:type="dxa" w:w="60"/>
+              <w:left w:type="dxa" w:w="90"/>
+              <w:bottom w:type="dxa" w:w="60"/>
+              <w:right w:type="dxa" w:w="90"/>
+            </w:tcMar>
+            <w:vAlign w:val="center"/>
+          </w:tcPr>
+          <w:p>
+            <w:pPr>
+              <w:spacing w:after="0" w:line="290"/>
+            </w:pPr>
+            <w:r>
+              <w:rPr>
+                <w:rFonts w:ascii="Microsoft JhengHei" w:cs="Microsoft JhengHei" w:eastAsia="Microsoft JhengHei" w:hAnsi="Microsoft JhengHei"/>
+                <w:b/>
+                <w:bCs/>
+                <w:sz w:val="19"/>
+                <w:szCs w:val="19"/>
+              </w:rPr>
+              <w:t xml:space="preserve">卡在哪裡（錯誤編碼）</w:t>
+            </w:r>
+          </w:p>
+        </w:tc>
+        <w:tc>
+          <w:tcPr>
+            <w:tcW w:type="dxa" w:w="2240"/>
+            <w:shd w:fill="DDE3EC" w:color="auto" w:val="clear"/>
+            <w:tcMar>
+              <w:top w:type="dxa" w:w="60"/>
+              <w:left w:type="dxa" w:w="90"/>
+              <w:bottom w:type="dxa" w:w="60"/>
+              <w:right w:type="dxa" w:w="90"/>
+            </w:tcMar>
+            <w:vAlign w:val="center"/>
+          </w:tcPr>
+          <w:p>
+            <w:pPr>
+              <w:spacing w:after="0" w:line="290"/>
+            </w:pPr>
+            <w:r>
+              <w:rPr>
+                <w:rFonts w:ascii="Microsoft JhengHei" w:cs="Microsoft JhengHei" w:eastAsia="Microsoft JhengHei" w:hAnsi="Microsoft JhengHei"/>
+                <w:b/>
+                <w:bCs/>
+                <w:sz w:val="19"/>
+                <w:szCs w:val="19"/>
+              </w:rPr>
+              <w:t xml:space="preserve">誰做的</w:t>
+            </w:r>
+          </w:p>
+        </w:tc>
+      </w:tr>
+      <w:tr>
+        <w:trPr>
+          <w:tblHeader w:val="false"/>
+        </w:trPr>
+        <w:tc>
+          <w:tcPr>
+            <w:tcW w:type="dxa" w:w="2600"/>
+            <w:tcMar>
+              <w:top w:type="dxa" w:w="60"/>
+              <w:left w:type="dxa" w:w="90"/>
+              <w:bottom w:type="dxa" w:w="60"/>
+              <w:right w:type="dxa" w:w="90"/>
+            </w:tcMar>
+            <w:vAlign w:val="center"/>
+          </w:tcPr>
+          <w:p>
+            <w:pPr>
+              <w:spacing w:after="0" w:line="290"/>
+            </w:pPr>
+            <w:r>
+              <w:rPr>
+                <w:rFonts w:ascii="Microsoft JhengHei" w:cs="Microsoft JhengHei" w:eastAsia="Microsoft JhengHei" w:hAnsi="Microsoft JhengHei"/>
+                <w:sz w:val="19"/>
+                <w:szCs w:val="19"/>
+              </w:rPr>
+              <w:t xml:space="preserve">Excel</w:t>
+            </w:r>
+          </w:p>
+        </w:tc>
+        <w:tc>
+          <w:tcPr>
+            <w:tcW w:type="dxa" w:w="2400"/>
+            <w:tcMar>
+              <w:top w:type="dxa" w:w="60"/>
+              <w:left w:type="dxa" w:w="90"/>
+              <w:bottom w:type="dxa" w:w="60"/>
+              <w:right w:type="dxa" w:w="90"/>
+            </w:tcMar>
+            <w:vAlign w:val="center"/>
+          </w:tcPr>
+          <w:p>
+            <w:pPr>
+              <w:spacing w:after="0" w:line="290"/>
+            </w:pPr>
+            <w:r>
+              <w:rPr>
+                <w:rFonts w:ascii="Microsoft JhengHei" w:cs="Microsoft JhengHei" w:eastAsia="Microsoft JhengHei" w:hAnsi="Microsoft JhengHei"/>
+                <w:sz w:val="19"/>
+                <w:szCs w:val="19"/>
+              </w:rPr>
+              <w:t xml:space="preserve"/>
+            </w:r>
+          </w:p>
+        </w:tc>
+        <w:tc>
+          <w:tcPr>
+            <w:tcW w:type="dxa" w:w="2400"/>
+            <w:tcMar>
+              <w:top w:type="dxa" w:w="60"/>
+              <w:left w:type="dxa" w:w="90"/>
+              <w:bottom w:type="dxa" w:w="60"/>
+              <w:right w:type="dxa" w:w="90"/>
+            </w:tcMar>
+            <w:vAlign w:val="center"/>
+          </w:tcPr>
+          <w:p>
+            <w:pPr>
+              <w:spacing w:after="0" w:line="290"/>
+            </w:pPr>
+            <w:r>
+              <w:rPr>
+                <w:rFonts w:ascii="Microsoft JhengHei" w:cs="Microsoft JhengHei" w:eastAsia="Microsoft JhengHei" w:hAnsi="Microsoft JhengHei"/>
+                <w:sz w:val="19"/>
+                <w:szCs w:val="19"/>
+              </w:rPr>
+              <w:t xml:space="preserve"/>
+            </w:r>
+          </w:p>
+        </w:tc>
+        <w:tc>
+          <w:tcPr>
+            <w:tcW w:type="dxa" w:w="2240"/>
+            <w:tcMar>
+              <w:top w:type="dxa" w:w="60"/>
+              <w:left w:type="dxa" w:w="90"/>
+              <w:bottom w:type="dxa" w:w="60"/>
+              <w:right w:type="dxa" w:w="90"/>
+            </w:tcMar>
+            <w:vAlign w:val="center"/>
+          </w:tcPr>
+          <w:p>
+            <w:pPr>
+              <w:spacing w:after="0" w:line="290"/>
+            </w:pPr>
+            <w:r>
+              <w:rPr>
+                <w:rFonts w:ascii="Microsoft JhengHei" w:cs="Microsoft JhengHei" w:eastAsia="Microsoft JhengHei" w:hAnsi="Microsoft JhengHei"/>
+                <w:sz w:val="19"/>
+                <w:szCs w:val="19"/>
+              </w:rPr>
+              <w:t xml:space="preserve"/>
+            </w:r>
+          </w:p>
+        </w:tc>
+      </w:tr>
+      <w:tr>
+        <w:trPr>
+          <w:tblHeader w:val="false"/>
+        </w:trPr>
+        <w:tc>
+          <w:tcPr>
+            <w:tcW w:type="dxa" w:w="2600"/>
+            <w:tcMar>
+              <w:top w:type="dxa" w:w="60"/>
+              <w:left w:type="dxa" w:w="90"/>
+              <w:bottom w:type="dxa" w:w="60"/>
+              <w:right w:type="dxa" w:w="90"/>
+            </w:tcMar>
+            <w:vAlign w:val="center"/>
+          </w:tcPr>
+          <w:p>
+            <w:pPr>
+              <w:spacing w:after="0" w:line="290"/>
+            </w:pPr>
+            <w:r>
+              <w:rPr>
+                <w:rFonts w:ascii="Microsoft JhengHei" w:cs="Microsoft JhengHei" w:eastAsia="Microsoft JhengHei" w:hAnsi="Microsoft JhengHei"/>
+                <w:sz w:val="19"/>
+                <w:szCs w:val="19"/>
+              </w:rPr>
+              <w:t xml:space="preserve">Python</w:t>
+            </w:r>
+          </w:p>
+        </w:tc>
+        <w:tc>
+          <w:tcPr>
+            <w:tcW w:type="dxa" w:w="2400"/>
+            <w:tcMar>
+              <w:top w:type="dxa" w:w="60"/>
+              <w:left w:type="dxa" w:w="90"/>
+              <w:bottom w:type="dxa" w:w="60"/>
+              <w:right w:type="dxa" w:w="90"/>
+            </w:tcMar>
+            <w:vAlign w:val="center"/>
+          </w:tcPr>
+          <w:p>
+            <w:pPr>
+              <w:spacing w:after="0" w:line="290"/>
+            </w:pPr>
+            <w:r>
+              <w:rPr>
+                <w:rFonts w:ascii="Microsoft JhengHei" w:cs="Microsoft JhengHei" w:eastAsia="Microsoft JhengHei" w:hAnsi="Microsoft JhengHei"/>
+                <w:sz w:val="19"/>
+                <w:szCs w:val="19"/>
+              </w:rPr>
+              <w:t xml:space="preserve"/>
+            </w:r>
+          </w:p>
+        </w:tc>
+        <w:tc>
+          <w:tcPr>
+            <w:tcW w:type="dxa" w:w="2400"/>
+            <w:tcMar>
+              <w:top w:type="dxa" w:w="60"/>
+              <w:left w:type="dxa" w:w="90"/>
+              <w:bottom w:type="dxa" w:w="60"/>
+              <w:right w:type="dxa" w:w="90"/>
+            </w:tcMar>
+            <w:vAlign w:val="center"/>
+          </w:tcPr>
+          <w:p>
+            <w:pPr>
+              <w:spacing w:after="0" w:line="290"/>
+            </w:pPr>
+            <w:r>
+              <w:rPr>
+                <w:rFonts w:ascii="Microsoft JhengHei" w:cs="Microsoft JhengHei" w:eastAsia="Microsoft JhengHei" w:hAnsi="Microsoft JhengHei"/>
+                <w:sz w:val="19"/>
+                <w:szCs w:val="19"/>
+              </w:rPr>
+              <w:t xml:space="preserve"/>
+            </w:r>
+          </w:p>
+        </w:tc>
+        <w:tc>
+          <w:tcPr>
+            <w:tcW w:type="dxa" w:w="2240"/>
+            <w:tcMar>
+              <w:top w:type="dxa" w:w="60"/>
+              <w:left w:type="dxa" w:w="90"/>
+              <w:bottom w:type="dxa" w:w="60"/>
+              <w:right w:type="dxa" w:w="90"/>
+            </w:tcMar>
+            <w:vAlign w:val="center"/>
+          </w:tcPr>
+          <w:p>
+            <w:pPr>
+              <w:spacing w:after="0" w:line="290"/>
+            </w:pPr>
+            <w:r>
+              <w:rPr>
+                <w:rFonts w:ascii="Microsoft JhengHei" w:cs="Microsoft JhengHei" w:eastAsia="Microsoft JhengHei" w:hAnsi="Microsoft JhengHei"/>
+                <w:sz w:val="19"/>
+                <w:szCs w:val="19"/>
+              </w:rPr>
+              <w:t xml:space="preserve"/>
+            </w:r>
+          </w:p>
+        </w:tc>
+      </w:tr>
+      <w:tr>
+        <w:trPr>
+          <w:tblHeader w:val="false"/>
+        </w:trPr>
+        <w:tc>
+          <w:tcPr>
+            <w:tcW w:type="dxa" w:w="2600"/>
+            <w:tcMar>
+              <w:top w:type="dxa" w:w="60"/>
+              <w:left w:type="dxa" w:w="90"/>
+              <w:bottom w:type="dxa" w:w="60"/>
+              <w:right w:type="dxa" w:w="90"/>
+            </w:tcMar>
+            <w:vAlign w:val="center"/>
+          </w:tcPr>
+          <w:p>
+            <w:pPr>
+              <w:spacing w:after="0" w:line="290"/>
+            </w:pPr>
+            <w:r>
+              <w:rPr>
+                <w:rFonts w:ascii="Microsoft JhengHei" w:cs="Microsoft JhengHei" w:eastAsia="Microsoft JhengHei" w:hAnsi="Microsoft JhengHei"/>
+                <w:sz w:val="19"/>
+                <w:szCs w:val="19"/>
+              </w:rPr>
+              <w:t xml:space="preserve">R</w:t>
+            </w:r>
+          </w:p>
+        </w:tc>
+        <w:tc>
+          <w:tcPr>
+            <w:tcW w:type="dxa" w:w="2400"/>
+            <w:tcMar>
+              <w:top w:type="dxa" w:w="60"/>
+              <w:left w:type="dxa" w:w="90"/>
+              <w:bottom w:type="dxa" w:w="60"/>
+              <w:right w:type="dxa" w:w="90"/>
+            </w:tcMar>
+            <w:vAlign w:val="center"/>
+          </w:tcPr>
+          <w:p>
+            <w:pPr>
+              <w:spacing w:after="0" w:line="290"/>
+            </w:pPr>
+            <w:r>
+              <w:rPr>
+                <w:rFonts w:ascii="Microsoft JhengHei" w:cs="Microsoft JhengHei" w:eastAsia="Microsoft JhengHei" w:hAnsi="Microsoft JhengHei"/>
+                <w:sz w:val="19"/>
+                <w:szCs w:val="19"/>
+              </w:rPr>
+              <w:t xml:space="preserve"/>
+            </w:r>
+          </w:p>
+        </w:tc>
+        <w:tc>
+          <w:tcPr>
+            <w:tcW w:type="dxa" w:w="2400"/>
+            <w:tcMar>
+              <w:top w:type="dxa" w:w="60"/>
+              <w:left w:type="dxa" w:w="90"/>
+              <w:bottom w:type="dxa" w:w="60"/>
+              <w:right w:type="dxa" w:w="90"/>
+            </w:tcMar>
+            <w:vAlign w:val="center"/>
+          </w:tcPr>
+          <w:p>
+            <w:pPr>
+              <w:spacing w:after="0" w:line="290"/>
+            </w:pPr>
+            <w:r>
+              <w:rPr>
+                <w:rFonts w:ascii="Microsoft JhengHei" w:cs="Microsoft JhengHei" w:eastAsia="Microsoft JhengHei" w:hAnsi="Microsoft JhengHei"/>
+                <w:sz w:val="19"/>
+                <w:szCs w:val="19"/>
+              </w:rPr>
+              <w:t xml:space="preserve"/>
+            </w:r>
+          </w:p>
+        </w:tc>
+        <w:tc>
+          <w:tcPr>
+            <w:tcW w:type="dxa" w:w="2240"/>
+            <w:tcMar>
+              <w:top w:type="dxa" w:w="60"/>
+              <w:left w:type="dxa" w:w="90"/>
+              <w:bottom w:type="dxa" w:w="60"/>
+              <w:right w:type="dxa" w:w="90"/>
+            </w:tcMar>
+            <w:vAlign w:val="center"/>
+          </w:tcPr>
+          <w:p>
+            <w:pPr>
+              <w:spacing w:after="0" w:line="290"/>
+            </w:pPr>
+            <w:r>
+              <w:rPr>
+                <w:rFonts w:ascii="Microsoft JhengHei" w:cs="Microsoft JhengHei" w:eastAsia="Microsoft JhengHei" w:hAnsi="Microsoft JhengHei"/>
+                <w:sz w:val="19"/>
+                <w:szCs w:val="19"/>
+              </w:rPr>
+              <w:t xml:space="preserve"/>
+            </w:r>
+          </w:p>
+        </w:tc>
+      </w:tr>
+    </w:tbl>
+    <w:p>
+      <w:pPr>
+        <w:pStyle w:val="Heading2"/>
+        <w:spacing w:after="110" w:before="230"/>
+      </w:pPr>
+      <w:r>
+        <w:rPr>
+          <w:rFonts w:ascii="Microsoft JhengHei" w:cs="Microsoft JhengHei" w:eastAsia="Microsoft JhengHei" w:hAnsi="Microsoft JhengHei"/>
+          <w:b/>
+          <w:bCs/>
+          <w:color w:val="1F3A93"/>
+          <w:sz w:val="26"/>
+          <w:szCs w:val="26"/>
+        </w:rPr>
+        <w:t xml:space="preserve">⑤ 判讀與推論邊界</w:t>
+      </w:r>
+    </w:p>
+    <w:p>
+      <w:pPr>
+        <w:spacing w:after="100" w:line="290"/>
+      </w:pPr>
+      <w:r>
+        <w:rPr>
+          <w:rFonts w:ascii="Microsoft JhengHei" w:cs="Microsoft JhengHei" w:eastAsia="Microsoft JhengHei" w:hAnsi="Microsoft JhengHei"/>
+          <w:sz w:val="20"/>
+          <w:szCs w:val="20"/>
+        </w:rPr>
+        <w:t xml:space="preserve">Q1　三種工具的 A 相差多少？B 相差多少？如果完全一樣，這證明了什麼、沒證明什麼？</w:t>
+      </w:r>
+    </w:p>
+    <w:p>
+      <w:pPr>
+        <w:spacing w:after="100" w:line="290"/>
+      </w:pPr>
+      <w:r>
+        <w:rPr>
+          <w:rFonts w:ascii="Microsoft JhengHei" w:cs="Microsoft JhengHei" w:eastAsia="Microsoft JhengHei" w:hAnsi="Microsoft JhengHei"/>
+          <w:sz w:val="20"/>
+          <w:szCs w:val="20"/>
+        </w:rPr>
+        <w:t xml:space="preserve"/>
+      </w:r>
+    </w:p>
+    <w:p>
+      <w:pPr>
+        <w:spacing w:after="100" w:line="290"/>
+      </w:pPr>
+      <w:r>
+        <w:rPr>
+          <w:rFonts w:ascii="Microsoft JhengHei" w:cs="Microsoft JhengHei" w:eastAsia="Microsoft JhengHei" w:hAnsi="Microsoft JhengHei"/>
+          <w:sz w:val="20"/>
+          <w:szCs w:val="20"/>
+        </w:rPr>
+        <w:t xml:space="preserve"/>
+      </w:r>
+    </w:p>
+    <w:p>
+      <w:pPr>
+        <w:spacing w:after="100" w:line="290"/>
+      </w:pPr>
+      <w:r>
+        <w:rPr>
+          <w:rFonts w:ascii="Microsoft JhengHei" w:cs="Microsoft JhengHei" w:eastAsia="Microsoft JhengHei" w:hAnsi="Microsoft JhengHei"/>
+          <w:sz w:val="20"/>
+          <w:szCs w:val="20"/>
+        </w:rPr>
+        <w:t xml:space="preserve">Q2　用句型寫結論：「在本資料（＿＿條線）下，三種工具給出的 A、B ＿＿＿＿；差異（若有）來自＿＿＿＿而非＿＿＿＿。此結果不能推論＿＿＿＿（例如：不能推論哪一種工具比較『準』——準不準由資料決定，不由工具決定）。」</w:t>
+      </w:r>
+    </w:p>
+    <w:p>
+      <w:pPr>
+        <w:spacing w:after="100" w:line="290"/>
+      </w:pPr>
+      <w:r>
+        <w:rPr>
+          <w:rFonts w:ascii="Microsoft JhengHei" w:cs="Microsoft JhengHei" w:eastAsia="Microsoft JhengHei" w:hAnsi="Microsoft JhengHei"/>
+          <w:sz w:val="20"/>
+          <w:szCs w:val="20"/>
+        </w:rPr>
+        <w:t xml:space="preserve"/>
+      </w:r>
+    </w:p>
+    <w:p>
+      <w:pPr>
+        <w:spacing w:after="100" w:line="290"/>
+      </w:pPr>
+      <w:r>
+        <w:rPr>
+          <w:rFonts w:ascii="Microsoft JhengHei" w:cs="Microsoft JhengHei" w:eastAsia="Microsoft JhengHei" w:hAnsi="Microsoft JhengHei"/>
+          <w:sz w:val="20"/>
+          <w:szCs w:val="20"/>
+        </w:rPr>
+        <w:t xml:space="preserve"/>
+      </w:r>
+    </w:p>
+    <w:p>
+      <w:pPr>
+        <w:pStyle w:val="Heading2"/>
+        <w:spacing w:after="110" w:before="230"/>
+      </w:pPr>
+      <w:r>
+        <w:rPr>
+          <w:rFonts w:ascii="Microsoft JhengHei" w:cs="Microsoft JhengHei" w:eastAsia="Microsoft JhengHei" w:hAnsi="Microsoft JhengHei"/>
+          <w:b/>
+          <w:bCs/>
+          <w:color w:val="1F3A93"/>
+          <w:sz w:val="26"/>
+          <w:szCs w:val="26"/>
+        </w:rPr>
+        <w:t xml:space="preserve">⑥ 反思與延伸</w:t>
+      </w:r>
+    </w:p>
+    <w:p>
+      <w:pPr>
+        <w:spacing w:after="100" w:line="290"/>
+      </w:pPr>
+      <w:r>
+        <w:rPr>
+          <w:rFonts w:ascii="Microsoft JhengHei" w:cs="Microsoft JhengHei" w:eastAsia="Microsoft JhengHei" w:hAnsi="Microsoft JhengHei"/>
+          <w:sz w:val="20"/>
+          <w:szCs w:val="20"/>
+        </w:rPr>
+        <w:t xml:space="preserve">R1　哪一種工具最快？最快的就是最好的嗎？如果換成 200 條線、20 台儀器、每週重做一次呢？</w:t>
+      </w:r>
+    </w:p>
+    <w:p>
+      <w:pPr>
+        <w:spacing w:after="100" w:line="290"/>
+      </w:pPr>
+      <w:r>
+        <w:rPr>
+          <w:rFonts w:ascii="Microsoft JhengHei" w:cs="Microsoft JhengHei" w:eastAsia="Microsoft JhengHei" w:hAnsi="Microsoft JhengHei"/>
+          <w:sz w:val="20"/>
+          <w:szCs w:val="20"/>
+        </w:rPr>
+        <w:t xml:space="preserve"/>
+      </w:r>
+    </w:p>
+    <w:p>
+      <w:pPr>
+        <w:spacing w:after="100" w:line="290"/>
+      </w:pPr>
+      <w:r>
+        <w:rPr>
+          <w:rFonts w:ascii="Microsoft JhengHei" w:cs="Microsoft JhengHei" w:eastAsia="Microsoft JhengHei" w:hAnsi="Microsoft JhengHei"/>
+          <w:sz w:val="20"/>
+          <w:szCs w:val="20"/>
+        </w:rPr>
+        <w:t xml:space="preserve"/>
+      </w:r>
+    </w:p>
+    <w:p>
+      <w:pPr>
+        <w:spacing w:after="100" w:line="290"/>
+      </w:pPr>
+      <w:r>
+        <w:rPr>
+          <w:rFonts w:ascii="Microsoft JhengHei" w:cs="Microsoft JhengHei" w:eastAsia="Microsoft JhengHei" w:hAnsi="Microsoft JhengHei"/>
+          <w:sz w:val="20"/>
+          <w:szCs w:val="20"/>
+        </w:rPr>
+        <w:t xml:space="preserve">R2　A 站你們用 Excel 算，B、C 站用程式——現在回頭看，工具換了，你們對「校正」這件事的理解有沒有跟著換？</w:t>
+      </w:r>
+    </w:p>
+    <w:p>
+      <w:pPr>
+        <w:spacing w:after="100" w:line="290"/>
+      </w:pPr>
+      <w:r>
+        <w:rPr>
+          <w:rFonts w:ascii="Microsoft JhengHei" w:cs="Microsoft JhengHei" w:eastAsia="Microsoft JhengHei" w:hAnsi="Microsoft JhengHei"/>
+          <w:sz w:val="20"/>
+          <w:szCs w:val="20"/>
+        </w:rPr>
+        <w:t xml:space="preserve"/>
+      </w:r>
+    </w:p>
+    <w:p>
+      <w:pPr>
+        <w:spacing w:after="100" w:line="290"/>
+      </w:pPr>
+      <w:r>
+        <w:rPr>
+          <w:rFonts w:ascii="Microsoft JhengHei" w:cs="Microsoft JhengHei" w:eastAsia="Microsoft JhengHei" w:hAnsi="Microsoft JhengHei"/>
+          <w:sz w:val="20"/>
+          <w:szCs w:val="20"/>
+        </w:rPr>
+        <w:t xml:space="preserve"/>
+      </w:r>
+    </w:p>
+    <w:p>
+      <w:pPr>
+        <w:spacing w:after="100" w:line="290"/>
+      </w:pPr>
+      <w:r>
+        <w:rPr>
+          <w:rFonts w:ascii="Microsoft JhengHei" w:cs="Microsoft JhengHei" w:eastAsia="Microsoft JhengHei" w:hAnsi="Microsoft JhengHei"/>
+          <w:sz w:val="20"/>
+          <w:szCs w:val="20"/>
+        </w:rPr>
+        <w:t xml:space="preserve"/>
+      </w:r>
+    </w:p>
+    <w:p>
+      <w:pPr>
+        <w:spacing w:after="80"/>
+        <w:jc w:val="center"/>
+      </w:pPr>
+      <w:r>
+        <w:rPr>
+          <w:rFonts w:ascii="Microsoft JhengHei" w:cs="Microsoft JhengHei" w:eastAsia="Microsoft JhengHei" w:hAnsi="Microsoft JhengHei"/>
+          <w:b/>
+          <w:bCs/>
+          <w:color w:val="1F3A93"/>
+          <w:sz w:val="40"/>
+          <w:szCs w:val="40"/>
+        </w:rPr>
         <w:t xml:space="preserve">通用附件</w:t>
       </w:r>
     </w:p>
@@ -19972,7 +22384,7 @@
                 <w:sz w:val="20"/>
                 <w:szCs w:val="20"/>
               </w:rPr>
-              <w:t xml:space="preserve">三軌一致性檢查（每站結束前做）</w:t>
+              <w:t xml:space="preserve">三軌一致性檢查（活動 E 做）</w:t>
             </w:r>
           </w:p>
           <w:p>

</xml_diff>